<commit_message>
W 10-28: pre-bible expanded to 10 pitches (kidnapping calls, card-declined follow-up, QR water, VA redirect, Amazon refunds)
Co-Authored-By: Claude Opus 5.5 <noreply@anthropic.com>
Claude-Session: https://claude.ai/code/session_01UspEBP6QgBD5uukQ429BR1
</commit_message>
<xml_diff>
--- a/runs/W_10282026/10_28_Wed_Pre_Bible_Pitch.docx
+++ b/runs/W_10282026/10_28_Wed_Pre_Bible_Pitch.docx
@@ -24,7 +24,7 @@
         <w:t>Wednesday, Oct 28, 2026</w:t>
       </w:r>
       <w:r>
-        <w:t xml:space="preserve"> (F2 story show, tapes Fri Oct 23) · A + B + C, no guest · Prepared Mon, Oct 19, 2026 · Built from the story finder's Wednesday picks, cut to five after checking sources on Oct 19. Coverage checked against 62 aired transcripts (Mar 18 to Sep 29) and the October uploads. Audience 55+.</w:t>
+        <w:t xml:space="preserve"> (F2 story show, tapes Fri Oct 23) · A + B + C, no guest · Prepared Mon, Oct 19, 2026 · Ten pitches, sources checked Oct 19 · Coverage checked through the Oct 16 upload · Audience 55+.</w:t>
       </w:r>
     </w:p>
     <w:p>
@@ -170,7 +170,7 @@
                 <w:b/>
                 <w:sz w:val="19"/>
               </w:rPr>
-              <w:t>HE "ACCIDENTALLY" REFUNDED YOU THOUSANDS — AND NOW HE WANTS IT BACK</w:t>
+              <w:t>HE "ACCIDENTALLY" REFUNDED YOU — NOW HE WANTS IT BACK</w:t>
             </w:r>
           </w:p>
         </w:tc>
@@ -186,7 +186,7 @@
               <w:rPr>
                 <w:sz w:val="19"/>
               </w:rPr>
-              <w:t>A fake Geek Squad agent makes your bank account look overpaid, and an 81-year-old hands a stranger $20,000.</w:t>
+              <w:t>Fake Geek Squad "overpays" you; an 81-year-old hands over $20,000.</w:t>
             </w:r>
           </w:p>
         </w:tc>
@@ -202,7 +202,7 @@
               <w:rPr>
                 <w:sz w:val="19"/>
               </w:rPr>
-              <w:t>🔥 TikTok 2.1M (seed figure, unverified)</w:t>
+              <w:t>🔥 TikTok 2.1M (seed, unverified)</w:t>
             </w:r>
           </w:p>
         </w:tc>
@@ -234,7 +234,7 @@
               <w:rPr>
                 <w:sz w:val="19"/>
               </w:rPr>
-              <w:t>HIGH — needs a local TV clip</w:t>
+              <w:t>HIGH — needs a TV clip</w:t>
             </w:r>
           </w:p>
         </w:tc>
@@ -269,7 +269,7 @@
                 <w:b/>
                 <w:sz w:val="19"/>
               </w:rPr>
-              <w:t>THE CALL SAYS YOUR SON IS IN JAIL. HE IS. THE CALLER IS STILL A SCAMMER</w:t>
+              <w:t>YOUR SON IS IN JAIL. THE CALLER IS STILL A SCAMMER</w:t>
             </w:r>
           </w:p>
         </w:tc>
@@ -285,7 +285,7 @@
               <w:rPr>
                 <w:sz w:val="19"/>
               </w:rPr>
-              <w:t>Scammers read the jail's booking list, call the family, know the charges, and take the "bail."</w:t>
+              <w:t>They read the jail list, know the charges, take the "bail."</w:t>
             </w:r>
           </w:p>
         </w:tc>
@@ -301,7 +301,7 @@
               <w:rPr>
                 <w:sz w:val="19"/>
               </w:rPr>
-              <w:t>— (local TV, views unconfirmed)</w:t>
+              <w:t>—</w:t>
             </w:r>
           </w:p>
         </w:tc>
@@ -333,7 +333,7 @@
               <w:rPr>
                 <w:sz w:val="19"/>
               </w:rPr>
-              <w:t>HIGH — audience fit is the question</w:t>
+              <w:t>HIGH — audience fit</w:t>
             </w:r>
           </w:p>
         </w:tc>
@@ -368,7 +368,7 @@
                 <w:b/>
                 <w:sz w:val="19"/>
               </w:rPr>
-              <w:t>IF YOU GET THIS EMAIL FROM YOUR DOCTOR, DON'T CLICK IT</w:t>
+              <w:t>YOUR DAUGHTER'S VOICE, SCREAMING</w:t>
             </w:r>
           </w:p>
         </w:tc>
@@ -384,7 +384,7 @@
               <w:rPr>
                 <w:sz w:val="19"/>
               </w:rPr>
-              <w:t>An email that looks like your own patient portal offers a free "Medicare kit," then takes your card.</w:t>
+              <w:t>A mom stays on the line 5.5 hours and wires $5,400.</w:t>
             </w:r>
           </w:p>
         </w:tc>
@@ -400,7 +400,7 @@
               <w:rPr>
                 <w:sz w:val="19"/>
               </w:rPr>
-              <w:t>CBS Philadelphia 170K (observed 10/19)</w:t>
+              <w:t>—</w:t>
             </w:r>
           </w:p>
         </w:tc>
@@ -416,7 +416,7 @@
               <w:rPr>
                 <w:sz w:val="19"/>
               </w:rPr>
-              <w:t>F2 B, or A option · TIME-SENSITIVE (enrollment ends Dec 7)</w:t>
+              <w:t>F2 A option</w:t>
             </w:r>
           </w:p>
         </w:tc>
@@ -432,7 +432,7 @@
               <w:rPr>
                 <w:sz w:val="19"/>
               </w:rPr>
-              <w:t>MEDIUM — 19 days after the Medicare show</w:t>
+              <w:t>MEDIUM — voice cloning aired May 13</w:t>
             </w:r>
           </w:p>
         </w:tc>
@@ -467,7 +467,7 @@
                 <w:b/>
                 <w:sz w:val="19"/>
               </w:rPr>
-              <w:t>THEY'RE BILLING YOU FOR DAMAGE YOU DIDN'T DO — FILM THIS BEFORE YOU DRIVE OFF</w:t>
+              <w:t>"YOUR CARD DECLINED." IT DIDN'T. THEY CHARGED BOTH</w:t>
             </w:r>
           </w:p>
         </w:tc>
@@ -483,7 +483,7 @@
               <w:rPr>
                 <w:sz w:val="19"/>
               </w:rPr>
-              <w:t>Weeks after you return a rental car, you get a damage bill, and the "proof" photo came off Reddit.</w:t>
+              <w:t>A $600 purchase ends as $44,280 on two cards.</w:t>
             </w:r>
           </w:p>
         </w:tc>
@@ -499,7 +499,7 @@
               <w:rPr>
                 <w:sz w:val="19"/>
               </w:rPr>
-              <w:t>KSL 539K (seed figure, unverified)</w:t>
+              <w:t>NPR film (TikTok 1.7M, unverified)</w:t>
             </w:r>
           </w:p>
         </w:tc>
@@ -531,7 +531,7 @@
               <w:rPr>
                 <w:sz w:val="19"/>
               </w:rPr>
-              <w:t>MEDIUM — no one ended up out of pocket</w:t>
+              <w:t>MEDIUM — follow-up to 10/14</w:t>
             </w:r>
           </w:p>
         </w:tc>
@@ -566,7 +566,7 @@
                 <w:b/>
                 <w:sz w:val="19"/>
               </w:rPr>
-              <w:t>YOUR PASTOR IS TEXTING YOU FOR GIFT CARDS? IT'S NOT HIM</w:t>
+              <w:t>THIS EMAIL FROM YOUR DOCTOR: DON'T CLICK</w:t>
             </w:r>
           </w:p>
         </w:tc>
@@ -582,7 +582,304 @@
               <w:rPr>
                 <w:sz w:val="19"/>
               </w:rPr>
-              <w:t>Someone who looks like your pastor asks for gift cards "for women with cancer," and one churchgoer lost $23,000.</w:t>
+              <w:t>A fake portal "Medicare kit" takes your card.</w:t>
+            </w:r>
+          </w:p>
+        </w:tc>
+        <w:tc>
+          <w:tcPr>
+            <w:tcW w:type="dxa" w:w="1224"/>
+          </w:tcPr>
+          <w:p>
+            <w:pPr>
+              <w:spacing w:after="40"/>
+            </w:pPr>
+            <w:r>
+              <w:rPr>
+                <w:sz w:val="19"/>
+              </w:rPr>
+              <w:t>CBS Phila. 170K (10/19)</w:t>
+            </w:r>
+          </w:p>
+        </w:tc>
+        <w:tc>
+          <w:tcPr>
+            <w:tcW w:type="dxa" w:w="1656"/>
+          </w:tcPr>
+          <w:p>
+            <w:pPr>
+              <w:spacing w:after="40"/>
+            </w:pPr>
+            <w:r>
+              <w:rPr>
+                <w:sz w:val="19"/>
+              </w:rPr>
+              <w:t>F2 B · TIME-SENSITIVE (Dec 7)</w:t>
+            </w:r>
+          </w:p>
+        </w:tc>
+        <w:tc>
+          <w:tcPr>
+            <w:tcW w:type="dxa" w:w="1224"/>
+          </w:tcPr>
+          <w:p>
+            <w:pPr>
+              <w:spacing w:after="40"/>
+            </w:pPr>
+            <w:r>
+              <w:rPr>
+                <w:sz w:val="19"/>
+              </w:rPr>
+              <w:t>MEDIUM — 19 days after Medicare show</w:t>
+            </w:r>
+          </w:p>
+        </w:tc>
+      </w:tr>
+      <w:tr>
+        <w:tc>
+          <w:tcPr>
+            <w:tcW w:type="dxa" w:w="504"/>
+          </w:tcPr>
+          <w:p>
+            <w:pPr>
+              <w:spacing w:after="40"/>
+            </w:pPr>
+            <w:r>
+              <w:rPr>
+                <w:sz w:val="19"/>
+              </w:rPr>
+              <w:t>6</w:t>
+            </w:r>
+          </w:p>
+        </w:tc>
+        <w:tc>
+          <w:tcPr>
+            <w:tcW w:type="dxa" w:w="2088"/>
+          </w:tcPr>
+          <w:p>
+            <w:pPr>
+              <w:spacing w:after="40"/>
+            </w:pPr>
+            <w:r>
+              <w:rPr>
+                <w:b/>
+                <w:sz w:val="19"/>
+              </w:rPr>
+              <w:t>BILLED FOR DAMAGE YOU DIDN'T DO</w:t>
+            </w:r>
+          </w:p>
+        </w:tc>
+        <w:tc>
+          <w:tcPr>
+            <w:tcW w:type="dxa" w:w="3384"/>
+          </w:tcPr>
+          <w:p>
+            <w:pPr>
+              <w:spacing w:after="40"/>
+            </w:pPr>
+            <w:r>
+              <w:rPr>
+                <w:sz w:val="19"/>
+              </w:rPr>
+              <w:t>The rental-car "proof" photo came off Reddit.</w:t>
+            </w:r>
+          </w:p>
+        </w:tc>
+        <w:tc>
+          <w:tcPr>
+            <w:tcW w:type="dxa" w:w="1224"/>
+          </w:tcPr>
+          <w:p>
+            <w:pPr>
+              <w:spacing w:after="40"/>
+            </w:pPr>
+            <w:r>
+              <w:rPr>
+                <w:sz w:val="19"/>
+              </w:rPr>
+              <w:t>KSL 539K (seed, unverified)</w:t>
+            </w:r>
+          </w:p>
+        </w:tc>
+        <w:tc>
+          <w:tcPr>
+            <w:tcW w:type="dxa" w:w="1656"/>
+          </w:tcPr>
+          <w:p>
+            <w:pPr>
+              <w:spacing w:after="40"/>
+            </w:pPr>
+            <w:r>
+              <w:rPr>
+                <w:sz w:val="19"/>
+              </w:rPr>
+              <w:t>F2 B</w:t>
+            </w:r>
+          </w:p>
+        </w:tc>
+        <w:tc>
+          <w:tcPr>
+            <w:tcW w:type="dxa" w:w="1224"/>
+          </w:tcPr>
+          <w:p>
+            <w:pPr>
+              <w:spacing w:after="40"/>
+            </w:pPr>
+            <w:r>
+              <w:rPr>
+                <w:sz w:val="19"/>
+              </w:rPr>
+              <w:t>MEDIUM — no one out of pocket</w:t>
+            </w:r>
+          </w:p>
+        </w:tc>
+      </w:tr>
+      <w:tr>
+        <w:tc>
+          <w:tcPr>
+            <w:tcW w:type="dxa" w:w="504"/>
+          </w:tcPr>
+          <w:p>
+            <w:pPr>
+              <w:spacing w:after="40"/>
+            </w:pPr>
+            <w:r>
+              <w:rPr>
+                <w:sz w:val="19"/>
+              </w:rPr>
+              <w:t>7</w:t>
+            </w:r>
+          </w:p>
+        </w:tc>
+        <w:tc>
+          <w:tcPr>
+            <w:tcW w:type="dxa" w:w="2088"/>
+          </w:tcPr>
+          <w:p>
+            <w:pPr>
+              <w:spacing w:after="40"/>
+            </w:pPr>
+            <w:r>
+              <w:rPr>
+                <w:b/>
+                <w:sz w:val="19"/>
+              </w:rPr>
+              <w:t>$2 FOR WATER. THE QR CODE TOOK $2,400</w:t>
+            </w:r>
+          </w:p>
+        </w:tc>
+        <w:tc>
+          <w:tcPr>
+            <w:tcW w:type="dxa" w:w="3384"/>
+          </w:tcPr>
+          <w:p>
+            <w:pPr>
+              <w:spacing w:after="40"/>
+            </w:pPr>
+            <w:r>
+              <w:rPr>
+                <w:sz w:val="19"/>
+              </w:rPr>
+              <w:t>One scan at a street stand; the bank won't pay.</w:t>
+            </w:r>
+          </w:p>
+        </w:tc>
+        <w:tc>
+          <w:tcPr>
+            <w:tcW w:type="dxa" w:w="1224"/>
+          </w:tcPr>
+          <w:p>
+            <w:pPr>
+              <w:spacing w:after="40"/>
+            </w:pPr>
+            <w:r>
+              <w:rPr>
+                <w:sz w:val="19"/>
+              </w:rPr>
+              <w:t>—</w:t>
+            </w:r>
+          </w:p>
+        </w:tc>
+        <w:tc>
+          <w:tcPr>
+            <w:tcW w:type="dxa" w:w="1656"/>
+          </w:tcPr>
+          <w:p>
+            <w:pPr>
+              <w:spacing w:after="40"/>
+            </w:pPr>
+            <w:r>
+              <w:rPr>
+                <w:sz w:val="19"/>
+              </w:rPr>
+              <w:t>F2 C</w:t>
+            </w:r>
+          </w:p>
+        </w:tc>
+        <w:tc>
+          <w:tcPr>
+            <w:tcW w:type="dxa" w:w="1224"/>
+          </w:tcPr>
+          <w:p>
+            <w:pPr>
+              <w:spacing w:after="40"/>
+            </w:pPr>
+            <w:r>
+              <w:rPr>
+                <w:sz w:val="19"/>
+              </w:rPr>
+              <w:t>MEDIUM — QR codes done before</w:t>
+            </w:r>
+          </w:p>
+        </w:tc>
+      </w:tr>
+      <w:tr>
+        <w:tc>
+          <w:tcPr>
+            <w:tcW w:type="dxa" w:w="504"/>
+          </w:tcPr>
+          <w:p>
+            <w:pPr>
+              <w:spacing w:after="40"/>
+            </w:pPr>
+            <w:r>
+              <w:rPr>
+                <w:sz w:val="19"/>
+              </w:rPr>
+              <w:t>8</w:t>
+            </w:r>
+          </w:p>
+        </w:tc>
+        <w:tc>
+          <w:tcPr>
+            <w:tcW w:type="dxa" w:w="2088"/>
+          </w:tcPr>
+          <w:p>
+            <w:pPr>
+              <w:spacing w:after="40"/>
+            </w:pPr>
+            <w:r>
+              <w:rPr>
+                <w:b/>
+                <w:sz w:val="19"/>
+              </w:rPr>
+              <w:t>YOUR PASTOR WANTS GIFT CARDS? IT'S NOT HIM</w:t>
+            </w:r>
+          </w:p>
+        </w:tc>
+        <w:tc>
+          <w:tcPr>
+            <w:tcW w:type="dxa" w:w="3384"/>
+          </w:tcPr>
+          <w:p>
+            <w:pPr>
+              <w:spacing w:after="40"/>
+            </w:pPr>
+            <w:r>
+              <w:rPr>
+                <w:sz w:val="19"/>
+              </w:rPr>
+              <w:t>A fake pastor's email cost one woman $23,000.</w:t>
             </w:r>
           </w:p>
         </w:tc>
@@ -635,6 +932,204 @@
           </w:p>
         </w:tc>
       </w:tr>
+      <w:tr>
+        <w:tc>
+          <w:tcPr>
+            <w:tcW w:type="dxa" w:w="504"/>
+          </w:tcPr>
+          <w:p>
+            <w:pPr>
+              <w:spacing w:after="40"/>
+            </w:pPr>
+            <w:r>
+              <w:rPr>
+                <w:sz w:val="19"/>
+              </w:rPr>
+              <w:t>9</w:t>
+            </w:r>
+          </w:p>
+        </w:tc>
+        <w:tc>
+          <w:tcPr>
+            <w:tcW w:type="dxa" w:w="2088"/>
+          </w:tcPr>
+          <w:p>
+            <w:pPr>
+              <w:spacing w:after="40"/>
+            </w:pPr>
+            <w:r>
+              <w:rPr>
+                <w:b/>
+                <w:sz w:val="19"/>
+              </w:rPr>
+              <w:t>THIS POST CAN STEAL YOUR VA CHECK</w:t>
+            </w:r>
+          </w:p>
+        </w:tc>
+        <w:tc>
+          <w:tcPr>
+            <w:tcW w:type="dxa" w:w="3384"/>
+          </w:tcPr>
+          <w:p>
+            <w:pPr>
+              <w:spacing w:after="40"/>
+            </w:pPr>
+            <w:r>
+              <w:rPr>
+                <w:sz w:val="19"/>
+              </w:rPr>
+              <w:t>A fake "grant" post reroutes VA benefits.</w:t>
+            </w:r>
+          </w:p>
+        </w:tc>
+        <w:tc>
+          <w:tcPr>
+            <w:tcW w:type="dxa" w:w="1224"/>
+          </w:tcPr>
+          <w:p>
+            <w:pPr>
+              <w:spacing w:after="40"/>
+            </w:pPr>
+            <w:r>
+              <w:rPr>
+                <w:sz w:val="19"/>
+              </w:rPr>
+              <w:t>—</w:t>
+            </w:r>
+          </w:p>
+        </w:tc>
+        <w:tc>
+          <w:tcPr>
+            <w:tcW w:type="dxa" w:w="1656"/>
+          </w:tcPr>
+          <w:p>
+            <w:pPr>
+              <w:spacing w:after="40"/>
+            </w:pPr>
+            <w:r>
+              <w:rPr>
+                <w:sz w:val="19"/>
+              </w:rPr>
+              <w:t>F2 C</w:t>
+            </w:r>
+          </w:p>
+        </w:tc>
+        <w:tc>
+          <w:tcPr>
+            <w:tcW w:type="dxa" w:w="1224"/>
+          </w:tcPr>
+          <w:p>
+            <w:pPr>
+              <w:spacing w:after="40"/>
+            </w:pPr>
+            <w:r>
+              <w:rPr>
+                <w:sz w:val="19"/>
+              </w:rPr>
+              <w:t>LOW — no named victim</w:t>
+            </w:r>
+          </w:p>
+        </w:tc>
+      </w:tr>
+      <w:tr>
+        <w:tc>
+          <w:tcPr>
+            <w:tcW w:type="dxa" w:w="504"/>
+          </w:tcPr>
+          <w:p>
+            <w:pPr>
+              <w:spacing w:after="40"/>
+            </w:pPr>
+            <w:r>
+              <w:rPr>
+                <w:sz w:val="19"/>
+              </w:rPr>
+              <w:t>10</w:t>
+            </w:r>
+          </w:p>
+        </w:tc>
+        <w:tc>
+          <w:tcPr>
+            <w:tcW w:type="dxa" w:w="2088"/>
+          </w:tcPr>
+          <w:p>
+            <w:pPr>
+              <w:spacing w:after="40"/>
+            </w:pPr>
+            <w:r>
+              <w:rPr>
+                <w:b/>
+                <w:sz w:val="19"/>
+              </w:rPr>
+              <w:t>REAL AMAZON REFUNDS — AND FAKE ONES</w:t>
+            </w:r>
+          </w:p>
+        </w:tc>
+        <w:tc>
+          <w:tcPr>
+            <w:tcW w:type="dxa" w:w="3384"/>
+          </w:tcPr>
+          <w:p>
+            <w:pPr>
+              <w:spacing w:after="40"/>
+            </w:pPr>
+            <w:r>
+              <w:rPr>
+                <w:sz w:val="19"/>
+              </w:rPr>
+              <w:t>Real money arrives on its own; the fake asks for a fee.</w:t>
+            </w:r>
+          </w:p>
+        </w:tc>
+        <w:tc>
+          <w:tcPr>
+            <w:tcW w:type="dxa" w:w="1224"/>
+          </w:tcPr>
+          <w:p>
+            <w:pPr>
+              <w:spacing w:after="40"/>
+            </w:pPr>
+            <w:r>
+              <w:rPr>
+                <w:sz w:val="19"/>
+              </w:rPr>
+              <w:t>—</w:t>
+            </w:r>
+          </w:p>
+        </w:tc>
+        <w:tc>
+          <w:tcPr>
+            <w:tcW w:type="dxa" w:w="1656"/>
+          </w:tcPr>
+          <w:p>
+            <w:pPr>
+              <w:spacing w:after="40"/>
+            </w:pPr>
+            <w:r>
+              <w:rPr>
+                <w:sz w:val="19"/>
+              </w:rPr>
+              <w:t>F2 C</w:t>
+            </w:r>
+          </w:p>
+        </w:tc>
+        <w:tc>
+          <w:tcPr>
+            <w:tcW w:type="dxa" w:w="1224"/>
+          </w:tcPr>
+          <w:p>
+            <w:pPr>
+              <w:spacing w:after="40"/>
+            </w:pPr>
+            <w:r>
+              <w:rPr>
+                <w:sz w:val="19"/>
+              </w:rPr>
+              <w:t>LOW — may have aired 10/16</w:t>
+            </w:r>
+          </w:p>
+        </w:tc>
+      </w:tr>
     </w:tbl>
     <w:p/>
     <w:p>
@@ -645,16 +1140,16 @@
         <w:t>SLATE FIT:</w:t>
       </w:r>
       <w:r>
-        <w:t xml:space="preserve"> Fills A + B + C with one to spare. My pick: </w:t>
+        <w:t xml:space="preserve"> Fills A + B + C several times over. My pick: </w:t>
       </w:r>
       <w:r>
         <w:rPr>
           <w:b/>
         </w:rPr>
-        <w:t>A #1, B #2, C #5.</w:t>
-      </w:r>
-      <w:r>
-        <w:t xml:space="preserve"> #3 is the stronger B if Jeff is fine with Medicare again; #4 holds for Thanksgiving travel. No guest: Jeff gives the tip after each case. ⚠️ 10/21 not checked. ⚠️ YouTube blocked upload dates on Oct 19; confirm every clip before the outline.</w:t>
+        <w:t>A #1, B #2, C #8</w:t>
+      </w:r>
+      <w:r>
+        <w:t>; alternates #3 (A) and #4 (B). No guest. ⚠️ 10/21 not checked; clip dates unconfirmed (YouTube blocked).</w:t>
       </w:r>
     </w:p>
     <w:p>
@@ -1209,7 +1704,7 @@
           <w:color w:val="000000"/>
           <w:sz w:val="32"/>
         </w:rPr>
-        <w:t>3. IF YOU GET THIS EMAIL FROM YOUR DOCTOR, DON'T CLICK IT</w:t>
+        <w:t>3. YOUR DAUGHTER'S VOICE, SCREAMING. FIVE HOURS ON THE PHONE</w:t>
       </w:r>
     </w:p>
     <w:p>
@@ -1220,7 +1715,7 @@
         <w:t>Slot:</w:t>
       </w:r>
       <w:r>
-        <w:t xml:space="preserve"> F2 B, or A option · </w:t>
+        <w:t xml:space="preserve"> F2 A option · </w:t>
       </w:r>
       <w:r>
         <w:rPr>
@@ -1235,7 +1730,7 @@
         <w:rPr>
           <w:i/>
         </w:rPr>
-        <w:t>Strong viewer tip; lands 19 days after the Oct 9 Medicare show</w:t>
+        <w:t>Strong victim and fresh coverage; voice cloning is on the dead list</w:t>
       </w:r>
     </w:p>
     <w:p>
@@ -1246,7 +1741,263 @@
         <w:t>SLOT FIT:</w:t>
       </w:r>
       <w:r>
-        <w:t xml:space="preserve"> A strong B. A scam with a villain, and the viewer is the target (MyChart has about 190M patients, per The National Desk). It's time-sensitive: open enrollment ends Dec 7. As an A it's thin: the losses we know of are small ($9.95), and the Oct 9 show already had scammers posing as a victim's doctor.</w:t>
+        <w:t xml:space="preserve"> It could carry an A: a parent is the target, the villain is clear, and she lost real money. The problem is the dead list: Jeff cloned his own voice on May 13. It only works pitched as what's new since then: hours on the line, the caller ID, and the errands to wire the money.</w:t>
+      </w:r>
+    </w:p>
+    <w:p>
+      <w:pPr>
+        <w:pStyle w:val="Heading3"/>
+      </w:pPr>
+      <w:r>
+        <w:rPr>
+          <w:color w:val="333333"/>
+          <w:sz w:val="22"/>
+        </w:rPr>
+        <w:t>WORKING TEASE</w:t>
+      </w:r>
+    </w:p>
+    <w:p>
+      <w:pPr>
+        <w:spacing w:before="80" w:after="120"/>
+        <w:ind w:left="432"/>
+      </w:pPr>
+      <w:r>
+        <w:rPr>
+          <w:i/>
+        </w:rPr>
+        <w:t>THE PHONE RINGS. IT'S YOUR DAUGHTER. SHE'S SCREAMING. THEN A MAN GETS ON. HE HAS HER. DON'T HANG UP. DON'T TELL ANYONE. THIS MOM STAYED ON THAT CALL FOR FIVE AND A HALF HOURS. SHE WIRED 54 HUNDRED DOLLARS. HER DAUGHTER WAS FINE THE WHOLE TIME. THE ONE QUESTION THAT ENDS THIS CALL IN SECONDS.</w:t>
+      </w:r>
+    </w:p>
+    <w:p>
+      <w:pPr>
+        <w:pStyle w:val="Heading3"/>
+      </w:pPr>
+      <w:r>
+        <w:rPr>
+          <w:color w:val="333333"/>
+          <w:sz w:val="22"/>
+        </w:rPr>
+        <w:t>THE HOOK</w:t>
+      </w:r>
+    </w:p>
+    <w:p>
+      <w:r>
+        <w:t>Deborah Del Mastro of Martinez, California, a Navy veteran, heard what sounded like her daughter Sarah, then a man claiming to be with a cartel. He demanded $20,000. Fox News says he kept her on the line for about five and a half hours, told her to keep her phone charged, gave her a cover story, and yelled when she muted the call to talk to her husband. She sent $5,400 in four wire transfers, starting at a Walmart (ABC7, May 24; Fox News, Oct 7). In Livingston, Montana, Victoria Bond lost more than $2,000 by Western Union at an Albertsons during a call of about an hour (MontanaRightNow, Aug 4).</w:t>
+      </w:r>
+    </w:p>
+    <w:p>
+      <w:pPr>
+        <w:pStyle w:val="Heading3"/>
+      </w:pPr>
+      <w:r>
+        <w:rPr>
+          <w:color w:val="333333"/>
+          <w:sz w:val="22"/>
+        </w:rPr>
+        <w:t>HOW IT WORKS</w:t>
+      </w:r>
+    </w:p>
+    <w:p>
+      <w:pPr>
+        <w:pStyle w:val="ListBullet"/>
+        <w:spacing w:after="40"/>
+      </w:pPr>
+      <w:r>
+        <w:t>A cloned voice of your child, built from clips online, then a "kidnapper" takes over.</w:t>
+      </w:r>
+    </w:p>
+    <w:p>
+      <w:pPr>
+        <w:pStyle w:val="ListBullet"/>
+        <w:spacing w:after="40"/>
+      </w:pPr>
+      <w:r>
+        <w:rPr>
+          <w:b/>
+        </w:rPr>
+        <w:t>They never let you hang up</w:t>
+      </w:r>
+      <w:r>
+        <w:t>: the call is the trap. You can't check on your daughter while you're on the line.</w:t>
+      </w:r>
+    </w:p>
+    <w:p>
+      <w:pPr>
+        <w:pStyle w:val="ListBullet"/>
+        <w:spacing w:after="40"/>
+      </w:pPr>
+      <w:r>
+        <w:t>They send you on errands to wire money or buy prepaid cards.</w:t>
+      </w:r>
+    </w:p>
+    <w:p>
+      <w:pPr>
+        <w:pStyle w:val="ListBullet"/>
+        <w:spacing w:after="40"/>
+      </w:pPr>
+      <w:r>
+        <w:t>The FBI warns some now send altered "proof of life" photos or video (IC3, Dec 5, 2025).</w:t>
+      </w:r>
+    </w:p>
+    <w:p>
+      <w:pPr>
+        <w:pStyle w:val="Heading3"/>
+      </w:pPr>
+      <w:r>
+        <w:rPr>
+          <w:color w:val="333333"/>
+          <w:sz w:val="22"/>
+        </w:rPr>
+        <w:t>WHAT'S NEW</w:t>
+      </w:r>
+    </w:p>
+    <w:p>
+      <w:r>
+        <w:t>May 13 was voice cloning itself (Jeff cloned his own voice). New: the hours-long call, the errands to Walmart and Albertsons, and the FBI's warning about faked photos and videos.</w:t>
+      </w:r>
+    </w:p>
+    <w:p>
+      <w:pPr>
+        <w:pStyle w:val="Heading3"/>
+      </w:pPr>
+      <w:r>
+        <w:rPr>
+          <w:color w:val="333333"/>
+          <w:sz w:val="22"/>
+        </w:rPr>
+        <w:t>FOOTAGE WE NEED</w:t>
+      </w:r>
+    </w:p>
+    <w:p>
+      <w:pPr>
+        <w:pStyle w:val="ListBullet"/>
+        <w:spacing w:after="40"/>
+      </w:pPr>
+      <w:r>
+        <w:rPr>
+          <w:b/>
+        </w:rPr>
+        <w:t>The get: ABC7 Bay Area's Del Mastro package</w:t>
+      </w:r>
+      <w:r>
+        <w:t xml:space="preserve"> (about 5.5K views; observed 10/19). Fox's CyberGuy clip, "This scam call cost me $5,400."</w:t>
+      </w:r>
+    </w:p>
+    <w:p>
+      <w:pPr>
+        <w:pStyle w:val="ListBullet"/>
+        <w:spacing w:after="40"/>
+      </w:pPr>
+      <w:r>
+        <w:t>MontanaRightNow (Bond). WGAL's "fake kidnapping videos" (content unverified).</w:t>
+      </w:r>
+    </w:p>
+    <w:p>
+      <w:pPr>
+        <w:pStyle w:val="Heading3"/>
+      </w:pPr>
+      <w:r>
+        <w:rPr>
+          <w:color w:val="333333"/>
+          <w:sz w:val="22"/>
+        </w:rPr>
+        <w:t>THE PAYOFF</w:t>
+      </w:r>
+    </w:p>
+    <w:p>
+      <w:pPr>
+        <w:pStyle w:val="ListBullet"/>
+        <w:spacing w:after="40"/>
+      </w:pPr>
+      <w:r>
+        <w:rPr>
+          <w:b/>
+        </w:rPr>
+        <w:t>Hang up and call your loved one yourself.</w:t>
+      </w:r>
+      <w:r>
+        <w:t xml:space="preserve"> No real kidnapper needs you to stay on the line.</w:t>
+      </w:r>
+    </w:p>
+    <w:p>
+      <w:pPr>
+        <w:pStyle w:val="ListBullet"/>
+        <w:spacing w:after="40"/>
+      </w:pPr>
+      <w:r>
+        <w:t>Set a family code word, in person.</w:t>
+      </w:r>
+    </w:p>
+    <w:p>
+      <w:pPr>
+        <w:pStyle w:val="ListBullet"/>
+        <w:spacing w:after="40"/>
+      </w:pPr>
+      <w:r>
+        <w:t>Text another family member to check while you stay calm.</w:t>
+      </w:r>
+    </w:p>
+    <w:p>
+      <w:pPr>
+        <w:pStyle w:val="ListBullet"/>
+        <w:spacing w:after="40"/>
+      </w:pPr>
+      <w:r>
+        <w:t>No ransom is ever paid by wire or prepaid card at a store.</w:t>
+      </w:r>
+    </w:p>
+    <w:p>
+      <w:r>
+        <w:br w:type="page"/>
+      </w:r>
+    </w:p>
+    <w:p>
+      <w:pPr>
+        <w:pStyle w:val="Heading1"/>
+      </w:pPr>
+      <w:r>
+        <w:rPr>
+          <w:color w:val="000000"/>
+          <w:sz w:val="32"/>
+        </w:rPr>
+        <w:t>4. "YOUR CARD DECLINED." IT DIDN'T. THEY CHARGED BOTH</w:t>
+      </w:r>
+    </w:p>
+    <w:p>
+      <w:r>
+        <w:rPr>
+          <w:b/>
+        </w:rPr>
+        <w:t>Slot:</w:t>
+      </w:r>
+      <w:r>
+        <w:t xml:space="preserve"> F2 B · </w:t>
+      </w:r>
+      <w:r>
+        <w:rPr>
+          <w:b/>
+        </w:rPr>
+        <w:t>Confidence: MEDIUM</w:t>
+      </w:r>
+      <w:r>
+        <w:t xml:space="preserve"> · </w:t>
+      </w:r>
+      <w:r>
+        <w:rPr>
+          <w:i/>
+        </w:rPr>
+        <w:t>Big new numbers from NPR; 14 days after our mall story</w:t>
+      </w:r>
+    </w:p>
+    <w:p>
+      <w:r>
+        <w:rPr>
+          <w:b/>
+        </w:rPr>
+        <w:t>SLOT FIT:</w:t>
+      </w:r>
+      <w:r>
+        <w:t xml:space="preserve"> A strong B, and an A on numbers alone. But the 10/14 A was mall skincare (Bee &amp; Co), so this has to be pitched as the follow-up: one family company behind thousands of stores, and the fake decline.</w:t>
       </w:r>
     </w:p>
     <w:p>
@@ -1265,7 +2016,7 @@
         <w:rPr>
           <w:i/>
         </w:rPr>
-        <w:t xml:space="preserve"> — YouTube, CBS Philadelphia, about 169,755 views (YouTube search, observed Oct 19), about one month old https://www.youtube.com/watch?v=vATdvkX57eU Appears to show: a CBS "In Your Corner" warning about scammers posing as MyChart (from the title and description). It doesn't say whether it covers the kit. </w:t>
+        <w:t xml:space="preserve"> — NPR documentary on NPR's own site (not YouTube); NPR TikTok 1.7M (the story finder's figure; TikTok blocks requests from here) https://www.npr.org/2026/10/14/nx-s1-6000621/mazal-group-investigation-documentary · https://www.tiktok.com/@npr/video/7696632021921074446 Appears to show: NPR's investigation of the stores, from the title and article. </w:t>
       </w:r>
       <w:r>
         <w:rPr>
@@ -1295,7 +2046,7 @@
         <w:rPr>
           <w:i/>
         </w:rPr>
-        <w:t>IT LOOKS LIKE IT CAME FROM YOUR DOCTOR'S OFFICE. SAME LOGO. SAME PORTAL YOU USE FOR YOUR LAB RESULTS. "YOU'VE BEEN SELECTED. CLAIM YOUR FREE MEDICARE KIT." FREE… UNTIL THE LAST STEP. JUST PAY THE SHIPPING. 41 HEALTH SYSTEMS ARE NOW WARNING THEIR OWN PATIENTS. ONE OF OUR VIEWERS GOT IT TOO. HERE'S WHAT SHE DID RIGHT.</w:t>
+        <w:t>SHE AGREED TO SPEND 600 DOLLARS ON SKIN CREAM. THEN THE CLERK SAID: "YOUR CARD DECLINED. GOT ANOTHER ONE?" IT HADN'T DECLINED. HER STATEMENT SHOWED TWO CHARGES. 44 THOUSAND DOLLARS. AFTER OUR SHOW TWO WEEKS AGO, NPR FOUND WHO'S BEHIND THOUSANDS OF THESE STORES. THE ONE THING TO DO THE SECOND A CLERK SAYS "DECLINED."</w:t>
       </w:r>
     </w:p>
     <w:p>
@@ -1312,7 +2063,7 @@
     </w:p>
     <w:p>
       <w:r>
-        <w:t>The emails and texts copy MyChart, the patient portal from Epic. Epic says it's not a breach, just scammers borrowing a name people trust. Click, and a countdown clock and a short survey lead to a "free" kit with a small shipping fee at the end. That fee is how they get your card (Denver Health, Oct 9). In an FTC complaint Gizmodo got through a records request, an Indiana patient wrote: "They then charge you the 9.95 and immediately try charging your card another 29.95." Pennsylvania's attorney general says no such kit exists. Our own viewer, 77, got the email on Oct 17, checked her real MyChart, found nothing there, and blocked the sender.</w:t>
+        <w:t>NPR traced dozens of skincare brands, sold in what a former employee estimates are at least 2,000 stores, to one family company, Mazal Group of Chatsworth, California (Oct 14). In police reports, shoppers say a clerk told them their card declined when it hadn't and charged a second card too. In Santa Fe, a 67-year-old agreed to spend $600 and found two charges totaling $44,280. NPR lists Mary Ellen Eckhert, 82, at $53,500 across four cards. Mazal says it "does not own or operate any retail locations."</w:t>
       </w:r>
     </w:p>
     <w:p>
@@ -1329,16 +2080,7 @@
     </w:p>
     <w:p>
       <w:r>
-        <w:t xml:space="preserve">Oct 9 ("They're Mailing THIS Card to Seniors") covered fake Medicare cards, spoofed calls and a fake call from a doctor. New here: a fake </w:t>
-      </w:r>
-      <w:r>
-        <w:rPr>
-          <w:i/>
-        </w:rPr>
-        <w:t>email</w:t>
-      </w:r>
-      <w:r>
-        <w:t xml:space="preserve"> that copies the portal itself.</w:t>
+        <w:t>The 10/14 show covered Bee &amp; Co. NPR doesn't connect Bee &amp; Co to Mazal. New: one company behind many store names, the fake decline, a federal case a decade ago, and a lab test that found markups of up to 130 times.</w:t>
       </w:r>
     </w:p>
     <w:p>
@@ -1362,10 +2104,10 @@
         <w:rPr>
           <w:b/>
         </w:rPr>
-        <w:t>The get: our viewer's screenshots</w:t>
-      </w:r>
-      <w:r>
-        <w:t>, with her permission.</w:t>
+        <w:t>The get: NPR's film</w:t>
+      </w:r>
+      <w:r>
+        <w:t>, which needs NPR's permission.</w:t>
       </w:r>
     </w:p>
     <w:p>
@@ -1374,25 +2116,7 @@
         <w:spacing w:after="40"/>
       </w:pPr>
       <w:r>
-        <w:t>CBS Philadelphia (above); NBC10 Philadelphia, 12K. 13News Now and KSAT are about the kit by name (small clips).</w:t>
-      </w:r>
-    </w:p>
-    <w:p>
-      <w:pPr>
-        <w:pStyle w:val="ListBullet"/>
-        <w:spacing w:after="40"/>
-      </w:pPr>
-      <w:r>
-        <w:t xml:space="preserve">Jeff opens the real MyChart app next to the fake email </w:t>
-      </w:r>
-      <w:r>
-        <w:rPr>
-          <w:i/>
-        </w:rPr>
-        <w:t>(demo)</w:t>
-      </w:r>
-      <w:r>
-        <w:t>.</w:t>
+        <w:t>Our own 10/14 clips for the callback.</w:t>
       </w:r>
     </w:p>
     <w:p>
@@ -1416,10 +2140,7 @@
         <w:rPr>
           <w:b/>
         </w:rPr>
-        <w:t>Never open MyChart from an email or a text.</w:t>
-      </w:r>
-      <w:r>
-        <w:t xml:space="preserve"> Open the app, or type in the address yourself, like our viewer did.</w:t>
+        <w:t>"Declined"? Stop. Open your bank app before you hand over another card.</w:t>
       </w:r>
     </w:p>
     <w:p>
@@ -1428,7 +2149,7 @@
         <w:spacing w:after="40"/>
       </w:pPr>
       <w:r>
-        <w:t>MyChart doesn't run giveaways, and a countdown clock means it's fake (Epic).</w:t>
+        <w:t>Ask for the total in writing before you pay.</w:t>
       </w:r>
     </w:p>
     <w:p>
@@ -1437,16 +2158,7 @@
         <w:spacing w:after="40"/>
       </w:pPr>
       <w:r>
-        <w:t>Already paid the shipping? Call your card company and get a new card.</w:t>
-      </w:r>
-    </w:p>
-    <w:p>
-      <w:pPr>
-        <w:pStyle w:val="ListBullet"/>
-        <w:spacing w:after="40"/>
-      </w:pPr>
-      <w:r>
-        <w:t>Report it to your doctor's office, and in Pennsylvania to scams@attorneygeneral.gov.</w:t>
+        <w:t>Already charged? Dispute it with your card company right away.</w:t>
       </w:r>
     </w:p>
     <w:p>
@@ -1463,7 +2175,7 @@
           <w:color w:val="000000"/>
           <w:sz w:val="32"/>
         </w:rPr>
-        <w:t>4. THEY'RE BILLING YOU FOR DAMAGE YOU DIDN'T DO — FILM THIS BEFORE YOU DRIVE OFF</w:t>
+        <w:t>5. IF YOU GET THIS EMAIL FROM YOUR DOCTOR, DON'T CLICK IT</w:t>
       </w:r>
     </w:p>
     <w:p>
@@ -1474,7 +2186,7 @@
         <w:t>Slot:</w:t>
       </w:r>
       <w:r>
-        <w:t xml:space="preserve"> F2 B · </w:t>
+        <w:t xml:space="preserve"> F2 B, or A option · </w:t>
       </w:r>
       <w:r>
         <w:rPr>
@@ -1489,7 +2201,7 @@
         <w:rPr>
           <w:i/>
         </w:rPr>
-        <w:t>Never done; the dispute cases all ended in refunds</w:t>
+        <w:t>Strong viewer tip; lands 19 days after the Oct 9 Medicare show</w:t>
       </w:r>
     </w:p>
     <w:p>
@@ -1500,7 +2212,7 @@
         <w:t>SLOT FIT:</w:t>
       </w:r>
       <w:r>
-        <w:t xml:space="preserve"> A good B with a clear villain: the host who faked the photo. The viewer is the one renting the car. It's not an A because every case we found ended with the bill dropped. It fits Thanksgiving travel better than Oct 28, and could be banked for a November Wednesday.</w:t>
+        <w:t xml:space="preserve"> A strong B. A scam with a villain, and the viewer is the target (MyChart has about 190M patients, per The National Desk). It's time-sensitive: open enrollment ends Dec 7. As an A it's thin: the losses we know of are small ($9.95), and the Oct 9 show already had scammers posing as a victim's doctor.</w:t>
       </w:r>
     </w:p>
     <w:p>
@@ -1519,7 +2231,7 @@
         <w:rPr>
           <w:i/>
         </w:rPr>
-        <w:t xml:space="preserve"> — YouTube, KSL News Utah, "Car rental service attempts to scam Utah woman out of hundreds," 539K views (the story finder's figure; YouTube blocked our lookup), upload date unconfirmed https://www.youtube.com/watch?v=1_wUVS5szfw Appears to show: the TV version of KSL's Oct 5 Turo story (matched by title). </w:t>
+        <w:t xml:space="preserve"> — YouTube, CBS Philadelphia, about 169,755 views (YouTube search, observed Oct 19), about one month old https://www.youtube.com/watch?v=vATdvkX57eU Appears to show: a CBS "In Your Corner" warning about scammers posing as MyChart (from the title and description). It doesn't say whether it covers the kit. </w:t>
       </w:r>
       <w:r>
         <w:rPr>
@@ -1549,7 +2261,7 @@
         <w:rPr>
           <w:i/>
         </w:rPr>
-        <w:t>YOU RETURN THE RENTAL CAR. EVERYTHING'S FINE. THEN THE BILL SHOWS UP. A NAIL IN THE TIRE. FIVE HUNDRED DOLLARS. HERE'S THE PHOTO. ONE PROBLEM: THAT PHOTO WAS ON REDDIT YEARS AGO. DIFFERENT CAR. AND THE HOST TEXTED HER HE'S FILED MORE THAN 5,000 TIRE CLAIMS. THE 60-SECOND VIDEO THAT SAVES YOU HUNDREDS.</w:t>
+        <w:t>IT LOOKS LIKE IT CAME FROM YOUR DOCTOR'S OFFICE. SAME LOGO. SAME PORTAL YOU USE FOR YOUR LAB RESULTS. "YOU'VE BEEN SELECTED. CLAIM YOUR FREE MEDICARE KIT." FREE… UNTIL THE LAST STEP. JUST PAY THE SHIPPING. 41 HEALTH SYSTEMS ARE NOW WARNING THEIR OWN PATIENTS. ONE OF OUR VIEWERS GOT IT TOO. HERE'S WHAT SHE DID RIGHT.</w:t>
       </w:r>
     </w:p>
     <w:p>
@@ -1566,7 +2278,33 @@
     </w:p>
     <w:p>
       <w:r>
-        <w:t>Hope Orr of Draper, Utah, rented a car on Turo. The host charged $165 for smoking and planned $500 for a nail in the tire. A reverse image search found his tire photo in a years-old Reddit post, showing a different model. KSL says Turo first upheld the claim, then refunded her and banned the host. Big companies are doing it with AI scanners: a 70-year-old St. Louis renter got a $2,000 Enterprise hail bill that was later dropped (KMOV, July 1), and a Hertz bill went to collections before it was closed 10 months later (InvestigateTV, June 29).</w:t>
+        <w:t>The emails and texts copy MyChart, the patient portal from Epic. Epic says it's not a breach, just scammers borrowing a name people trust. Click, and a countdown clock and a short survey lead to a "free" kit with a small shipping fee at the end. That fee is how they get your card (Denver Health, Oct 9). In an FTC complaint Gizmodo got through a records request, an Indiana patient wrote: "They then charge you the 9.95 and immediately try charging your card another 29.95." Pennsylvania's attorney general says no such kit exists. Our own viewer, 77, got the email on Oct 17, checked her real MyChart, found nothing there, and blocked the sender.</w:t>
+      </w:r>
+    </w:p>
+    <w:p>
+      <w:pPr>
+        <w:pStyle w:val="Heading3"/>
+      </w:pPr>
+      <w:r>
+        <w:rPr>
+          <w:color w:val="333333"/>
+          <w:sz w:val="22"/>
+        </w:rPr>
+        <w:t>WHAT'S NEW</w:t>
+      </w:r>
+    </w:p>
+    <w:p>
+      <w:r>
+        <w:t xml:space="preserve">Oct 9 ("They're Mailing THIS Card to Seniors") covered fake Medicare cards, spoofed calls and a fake call from a doctor. New here: a fake </w:t>
+      </w:r>
+      <w:r>
+        <w:rPr>
+          <w:i/>
+        </w:rPr>
+        <w:t>email</w:t>
+      </w:r>
+      <w:r>
+        <w:t xml:space="preserve"> that copies the portal itself.</w:t>
       </w:r>
     </w:p>
     <w:p>
@@ -1590,10 +2328,10 @@
         <w:rPr>
           <w:b/>
         </w:rPr>
-        <w:t>The get: KSL "Get Gephardt"</w:t>
-      </w:r>
-      <w:r>
-        <w:t xml:space="preserve"> (above).</w:t>
+        <w:t>The get: our viewer's screenshots</w:t>
+      </w:r>
+      <w:r>
+        <w:t>, with her permission.</w:t>
       </w:r>
     </w:p>
     <w:p>
@@ -1602,7 +2340,7 @@
         <w:spacing w:after="40"/>
       </w:pPr>
       <w:r>
-        <w:t>InvestigateTV and KMOV packages (Hertz, Sixt, Enterprise). AI-scanner b-roll from FOX 26.</w:t>
+        <w:t>CBS Philadelphia (above); NBC10 Philadelphia, 12K. 13News Now and KSAT are about the kit by name (small clips).</w:t>
       </w:r>
     </w:p>
     <w:p>
@@ -1611,7 +2349,7 @@
         <w:spacing w:after="40"/>
       </w:pPr>
       <w:r>
-        <w:t xml:space="preserve">Jeff films a walkaround of a car in the lot </w:t>
+        <w:t xml:space="preserve">Jeff opens the real MyChart app next to the fake email </w:t>
       </w:r>
       <w:r>
         <w:rPr>
@@ -1644,7 +2382,10 @@
         <w:rPr>
           <w:b/>
         </w:rPr>
-        <w:t>Film a slow walkaround, roof and tires and inside, at pickup and again at drop-off.</w:t>
+        <w:t>Never open MyChart from an email or a text.</w:t>
+      </w:r>
+      <w:r>
+        <w:t xml:space="preserve"> Open the app, or type in the address yourself, like our viewer did.</w:t>
       </w:r>
     </w:p>
     <w:p>
@@ -1653,7 +2394,7 @@
         <w:spacing w:after="40"/>
       </w:pPr>
       <w:r>
-        <w:t>Don't leave the lot without the check-in report or the scanner report.</w:t>
+        <w:t>MyChart doesn't run giveaways, and a countdown clock means it's fake (Epic).</w:t>
       </w:r>
     </w:p>
     <w:p>
@@ -1662,7 +2403,7 @@
         <w:spacing w:after="40"/>
       </w:pPr>
       <w:r>
-        <w:t>Before paying, ask for before-and-after photos and the repair invoice. Dispute it in writing.</w:t>
+        <w:t>Already paid the shipping? Call your card company and get a new card.</w:t>
       </w:r>
     </w:p>
     <w:p>
@@ -1671,7 +2412,7 @@
         <w:spacing w:after="40"/>
       </w:pPr>
       <w:r>
-        <w:t>Check your own car insurance and credit card coverage before you buy theirs.</w:t>
+        <w:t>Report it to your doctor's office, and in Pennsylvania to scams@attorneygeneral.gov.</w:t>
       </w:r>
     </w:p>
     <w:p>
@@ -1688,7 +2429,7 @@
           <w:color w:val="000000"/>
           <w:sz w:val="32"/>
         </w:rPr>
-        <w:t>5. YOUR PASTOR IS TEXTING YOU FOR GIFT CARDS? IT'S NOT HIM</w:t>
+        <w:t>6. THEY'RE BILLING YOU FOR DAMAGE YOU DIDN'T DO — FILM THIS BEFORE YOU DRIVE OFF</w:t>
       </w:r>
     </w:p>
     <w:p>
@@ -1699,7 +2440,7 @@
         <w:t>Slot:</w:t>
       </w:r>
       <w:r>
-        <w:t xml:space="preserve"> F2 C · </w:t>
+        <w:t xml:space="preserve"> F2 B · </w:t>
       </w:r>
       <w:r>
         <w:rPr>
@@ -1714,7 +2455,7 @@
         <w:rPr>
           <w:i/>
         </w:rPr>
-        <w:t>Real 2026 losses; video not yet dated</w:t>
+        <w:t>Never done; the dispute cases all ended in refunds</w:t>
       </w:r>
     </w:p>
     <w:p>
@@ -1725,7 +2466,32 @@
         <w:t>SLOT FIT:</w:t>
       </w:r>
       <w:r>
-        <w:t xml:space="preserve"> A C, as a quick hit. The victims are our audience, as the pastor below says. It's small, but the trusted name is new. Gift cards have come up only as the way scammers get paid in past shows, never as a story about church members.</w:t>
+        <w:t xml:space="preserve"> A good B with a clear villain: the host who faked the photo. The viewer is the one renting the car. It's not an A because every case we found ended with the bill dropped. It fits Thanksgiving travel better than Oct 28, and could be banked for a November Wednesday.</w:t>
+      </w:r>
+    </w:p>
+    <w:p>
+      <w:pPr>
+        <w:spacing w:before="80" w:after="120"/>
+        <w:ind w:left="432"/>
+      </w:pPr>
+      <w:r>
+        <w:rPr>
+          <w:b/>
+          <w:i/>
+        </w:rPr>
+        <w:t>CLIP</w:t>
+      </w:r>
+      <w:r>
+        <w:rPr>
+          <w:i/>
+        </w:rPr>
+        <w:t xml:space="preserve"> — YouTube, KSL News Utah, "Car rental service attempts to scam Utah woman out of hundreds," 539K views (the story finder's figure; YouTube blocked our lookup), upload date unconfirmed https://www.youtube.com/watch?v=1_wUVS5szfw Appears to show: the TV version of KSL's Oct 5 Turo story (matched by title). </w:t>
+      </w:r>
+      <w:r>
+        <w:rPr>
+          <w:i/>
+        </w:rPr>
+        <w:t>Not watched — no timecode, no outcue, no confirmation of what's on screen.</w:t>
       </w:r>
     </w:p>
     <w:p>
@@ -1749,7 +2515,7 @@
         <w:rPr>
           <w:i/>
         </w:rPr>
-        <w:t>THE TEXT IS FROM YOUR PASTOR. HE NEEDS A FAVOR. QUIETLY. GIFT CARDS… FOR WOMEN FIGHTING CANCER. ONE WOMAN IN TEXAS SAYS SHE LOST 23 THOUSAND DOLLARS. IT'S NOT YOUR PASTOR. HERE'S HOW TO KNOW IN TEN SECONDS.</w:t>
+        <w:t>YOU RETURN THE RENTAL CAR. EVERYTHING'S FINE. THEN THE BILL SHOWS UP. A NAIL IN THE TIRE. FIVE HUNDRED DOLLARS. HERE'S THE PHOTO. ONE PROBLEM: THAT PHOTO WAS ON REDDIT YEARS AGO. DIFFERENT CAR. AND THE HOST TEXTED HER HE'S FILED MORE THAN 5,000 TIRE CLAIMS. THE 60-SECOND VIDEO THAT SAVES YOU HUNDREDS.</w:t>
       </w:r>
     </w:p>
     <w:p>
@@ -1766,6 +2532,382 @@
     </w:p>
     <w:p>
       <w:r>
+        <w:t>Hope Orr of Draper, Utah, rented a car on Turo. The host charged $165 for smoking and planned $500 for a nail in the tire. A reverse image search found his tire photo in a years-old Reddit post, showing a different model. KSL says Turo first upheld the claim, then refunded her and banned the host. Big companies are doing it with AI scanners: a 70-year-old St. Louis renter got a $2,000 Enterprise hail bill that was later dropped (KMOV, July 1), and a Hertz bill went to collections before it was closed 10 months later (InvestigateTV, June 29).</w:t>
+      </w:r>
+    </w:p>
+    <w:p>
+      <w:pPr>
+        <w:pStyle w:val="Heading3"/>
+      </w:pPr>
+      <w:r>
+        <w:rPr>
+          <w:color w:val="333333"/>
+          <w:sz w:val="22"/>
+        </w:rPr>
+        <w:t>FOOTAGE WE NEED</w:t>
+      </w:r>
+    </w:p>
+    <w:p>
+      <w:pPr>
+        <w:pStyle w:val="ListBullet"/>
+        <w:spacing w:after="40"/>
+      </w:pPr>
+      <w:r>
+        <w:rPr>
+          <w:b/>
+        </w:rPr>
+        <w:t>The get: KSL "Get Gephardt"</w:t>
+      </w:r>
+      <w:r>
+        <w:t xml:space="preserve"> (above).</w:t>
+      </w:r>
+    </w:p>
+    <w:p>
+      <w:pPr>
+        <w:pStyle w:val="ListBullet"/>
+        <w:spacing w:after="40"/>
+      </w:pPr>
+      <w:r>
+        <w:t>InvestigateTV and KMOV packages (Hertz, Sixt, Enterprise). AI-scanner b-roll from FOX 26.</w:t>
+      </w:r>
+    </w:p>
+    <w:p>
+      <w:pPr>
+        <w:pStyle w:val="ListBullet"/>
+        <w:spacing w:after="40"/>
+      </w:pPr>
+      <w:r>
+        <w:t xml:space="preserve">Jeff films a walkaround of a car in the lot </w:t>
+      </w:r>
+      <w:r>
+        <w:rPr>
+          <w:i/>
+        </w:rPr>
+        <w:t>(demo)</w:t>
+      </w:r>
+      <w:r>
+        <w:t>.</w:t>
+      </w:r>
+    </w:p>
+    <w:p>
+      <w:pPr>
+        <w:pStyle w:val="Heading3"/>
+      </w:pPr>
+      <w:r>
+        <w:rPr>
+          <w:color w:val="333333"/>
+          <w:sz w:val="22"/>
+        </w:rPr>
+        <w:t>THE PAYOFF</w:t>
+      </w:r>
+    </w:p>
+    <w:p>
+      <w:pPr>
+        <w:pStyle w:val="ListBullet"/>
+        <w:spacing w:after="40"/>
+      </w:pPr>
+      <w:r>
+        <w:rPr>
+          <w:b/>
+        </w:rPr>
+        <w:t>Film a slow walkaround, roof and tires and inside, at pickup and again at drop-off.</w:t>
+      </w:r>
+    </w:p>
+    <w:p>
+      <w:pPr>
+        <w:pStyle w:val="ListBullet"/>
+        <w:spacing w:after="40"/>
+      </w:pPr>
+      <w:r>
+        <w:t>Don't leave the lot without the check-in report or the scanner report.</w:t>
+      </w:r>
+    </w:p>
+    <w:p>
+      <w:pPr>
+        <w:pStyle w:val="ListBullet"/>
+        <w:spacing w:after="40"/>
+      </w:pPr>
+      <w:r>
+        <w:t>Before paying, ask for before-and-after photos and the repair invoice. Dispute it in writing.</w:t>
+      </w:r>
+    </w:p>
+    <w:p>
+      <w:pPr>
+        <w:pStyle w:val="ListBullet"/>
+        <w:spacing w:after="40"/>
+      </w:pPr>
+      <w:r>
+        <w:t>Check your own car insurance and credit card coverage before you buy theirs.</w:t>
+      </w:r>
+    </w:p>
+    <w:p>
+      <w:r>
+        <w:br w:type="page"/>
+      </w:r>
+    </w:p>
+    <w:p>
+      <w:pPr>
+        <w:pStyle w:val="Heading1"/>
+      </w:pPr>
+      <w:r>
+        <w:rPr>
+          <w:color w:val="000000"/>
+          <w:sz w:val="32"/>
+        </w:rPr>
+        <w:t>7. SHE PAID $2 FOR WATER. THE QR CODE TOOK $2,400</w:t>
+      </w:r>
+    </w:p>
+    <w:p>
+      <w:r>
+        <w:rPr>
+          <w:b/>
+        </w:rPr>
+        <w:t>Slot:</w:t>
+      </w:r>
+      <w:r>
+        <w:t xml:space="preserve"> F2 C · </w:t>
+      </w:r>
+      <w:r>
+        <w:rPr>
+          <w:b/>
+        </w:rPr>
+        <w:t>Confidence: MEDIUM</w:t>
+      </w:r>
+      <w:r>
+        <w:t xml:space="preserve"> · </w:t>
+      </w:r>
+      <w:r>
+        <w:rPr>
+          <w:i/>
+        </w:rPr>
+        <w:t>Fresh case; Jeff has said we've done QR codes</w:t>
+      </w:r>
+    </w:p>
+    <w:p>
+      <w:r>
+        <w:rPr>
+          <w:b/>
+        </w:rPr>
+        <w:t>SLOT FIT:</w:t>
+      </w:r>
+      <w:r>
+        <w:t xml:space="preserve"> A C. The victim is young, but anyone paying a street vendor or a parking meter is the target. QR codes are banked "only with new material"; this case is new: the bank calls it authorized.</w:t>
+      </w:r>
+    </w:p>
+    <w:p>
+      <w:pPr>
+        <w:pStyle w:val="Heading3"/>
+      </w:pPr>
+      <w:r>
+        <w:rPr>
+          <w:color w:val="333333"/>
+          <w:sz w:val="22"/>
+        </w:rPr>
+        <w:t>WORKING TEASE</w:t>
+      </w:r>
+    </w:p>
+    <w:p>
+      <w:pPr>
+        <w:spacing w:before="80" w:after="120"/>
+        <w:ind w:left="432"/>
+      </w:pPr>
+      <w:r>
+        <w:rPr>
+          <w:i/>
+        </w:rPr>
+        <w:t>TWO DOLLARS. A BOTTLE OF WATER ON A HOT DAY. SHE SCANNED HIS QR CODE TO PAY. MINUTES LATER: 12 HUNDRED GONE ON ZELLE. ANOTHER 12 HUNDRED ON APPLE PAY. HER BANK? WON'T PAY HER BACK.</w:t>
+      </w:r>
+    </w:p>
+    <w:p>
+      <w:pPr>
+        <w:pStyle w:val="Heading3"/>
+      </w:pPr>
+      <w:r>
+        <w:rPr>
+          <w:color w:val="333333"/>
+          <w:sz w:val="22"/>
+        </w:rPr>
+        <w:t>THE HOOK</w:t>
+      </w:r>
+    </w:p>
+    <w:p>
+      <w:r>
+        <w:t>Monet Swann bought a $2 bottle of water from a vendor in Midtown Atlanta on Oct 1. She scanned his QR code and says she shared her screen to pay. "I screenshared and authorized a two-dollar purchase from Zelle, and unfortunately, he took $1,200 from me." Another $1,200 went out on Apple Pay. Atlanta police are investigating, and her bank hasn't refunded her (FOX 5 Atlanta, Oct 9).</w:t>
+      </w:r>
+    </w:p>
+    <w:p>
+      <w:pPr>
+        <w:pStyle w:val="Heading3"/>
+      </w:pPr>
+      <w:r>
+        <w:rPr>
+          <w:color w:val="333333"/>
+          <w:sz w:val="22"/>
+        </w:rPr>
+        <w:t>FOOTAGE WE NEED</w:t>
+      </w:r>
+    </w:p>
+    <w:p>
+      <w:pPr>
+        <w:pStyle w:val="ListBullet"/>
+        <w:spacing w:after="40"/>
+      </w:pPr>
+      <w:r>
+        <w:rPr>
+          <w:b/>
+        </w:rPr>
+        <w:t>The get: 11Alive's package</w:t>
+      </w:r>
+      <w:r>
+        <w:t xml:space="preserve"> (YouTube; views and date unconfirmed) and FOX 5 Atlanta.</w:t>
+      </w:r>
+    </w:p>
+    <w:p>
+      <w:pPr>
+        <w:pStyle w:val="ListBullet"/>
+        <w:spacing w:after="40"/>
+      </w:pPr>
+      <w:r>
+        <w:t>The FTC's Sept 3 alert on fake QR stickers on parking meters, for the bigger picture.</w:t>
+      </w:r>
+    </w:p>
+    <w:p>
+      <w:pPr>
+        <w:pStyle w:val="Heading3"/>
+      </w:pPr>
+      <w:r>
+        <w:rPr>
+          <w:color w:val="333333"/>
+          <w:sz w:val="22"/>
+        </w:rPr>
+        <w:t>THE PAYOFF</w:t>
+      </w:r>
+    </w:p>
+    <w:p>
+      <w:pPr>
+        <w:pStyle w:val="ListBullet"/>
+        <w:spacing w:after="40"/>
+      </w:pPr>
+      <w:r>
+        <w:rPr>
+          <w:b/>
+        </w:rPr>
+        <w:t>Never let a stranger's QR code open your payment app.</w:t>
+      </w:r>
+      <w:r>
+        <w:t xml:space="preserve"> Pay cash or tap your own card.</w:t>
+      </w:r>
+    </w:p>
+    <w:p>
+      <w:pPr>
+        <w:pStyle w:val="ListBullet"/>
+        <w:spacing w:after="40"/>
+      </w:pPr>
+      <w:r>
+        <w:t>Never share your screen with anyone to pay.</w:t>
+      </w:r>
+    </w:p>
+    <w:p>
+      <w:pPr>
+        <w:pStyle w:val="ListBullet"/>
+        <w:spacing w:after="40"/>
+      </w:pPr>
+      <w:r>
+        <w:t>Check the web address a QR code opens before you go further (FTC).</w:t>
+      </w:r>
+    </w:p>
+    <w:p>
+      <w:r>
+        <w:br w:type="page"/>
+      </w:r>
+    </w:p>
+    <w:p>
+      <w:pPr>
+        <w:pStyle w:val="Heading1"/>
+      </w:pPr>
+      <w:r>
+        <w:rPr>
+          <w:color w:val="000000"/>
+          <w:sz w:val="32"/>
+        </w:rPr>
+        <w:t>8. YOUR PASTOR IS TEXTING YOU FOR GIFT CARDS? IT'S NOT HIM</w:t>
+      </w:r>
+    </w:p>
+    <w:p>
+      <w:r>
+        <w:rPr>
+          <w:b/>
+        </w:rPr>
+        <w:t>Slot:</w:t>
+      </w:r>
+      <w:r>
+        <w:t xml:space="preserve"> F2 C · </w:t>
+      </w:r>
+      <w:r>
+        <w:rPr>
+          <w:b/>
+        </w:rPr>
+        <w:t>Confidence: MEDIUM</w:t>
+      </w:r>
+      <w:r>
+        <w:t xml:space="preserve"> · </w:t>
+      </w:r>
+      <w:r>
+        <w:rPr>
+          <w:i/>
+        </w:rPr>
+        <w:t>Real 2026 losses; video not yet dated</w:t>
+      </w:r>
+    </w:p>
+    <w:p>
+      <w:r>
+        <w:rPr>
+          <w:b/>
+        </w:rPr>
+        <w:t>SLOT FIT:</w:t>
+      </w:r>
+      <w:r>
+        <w:t xml:space="preserve"> A C, as a quick hit. The victims are our audience, as the pastor below says. It's small, but the trusted name is new. Gift cards have come up only as the way scammers get paid in past shows, never as a story about church members.</w:t>
+      </w:r>
+    </w:p>
+    <w:p>
+      <w:pPr>
+        <w:pStyle w:val="Heading3"/>
+      </w:pPr>
+      <w:r>
+        <w:rPr>
+          <w:color w:val="333333"/>
+          <w:sz w:val="22"/>
+        </w:rPr>
+        <w:t>WORKING TEASE</w:t>
+      </w:r>
+    </w:p>
+    <w:p>
+      <w:pPr>
+        <w:spacing w:before="80" w:after="120"/>
+        <w:ind w:left="432"/>
+      </w:pPr>
+      <w:r>
+        <w:rPr>
+          <w:i/>
+        </w:rPr>
+        <w:t>THE TEXT IS FROM YOUR PASTOR. HE NEEDS A FAVOR. QUIETLY. GIFT CARDS… FOR WOMEN FIGHTING CANCER. ONE WOMAN IN TEXAS SAYS SHE LOST 23 THOUSAND DOLLARS. IT'S NOT YOUR PASTOR. HERE'S HOW TO KNOW IN TEN SECONDS.</w:t>
+      </w:r>
+    </w:p>
+    <w:p>
+      <w:pPr>
+        <w:pStyle w:val="Heading3"/>
+      </w:pPr>
+      <w:r>
+        <w:rPr>
+          <w:color w:val="333333"/>
+          <w:sz w:val="22"/>
+        </w:rPr>
+        <w:t>THE HOOK</w:t>
+      </w:r>
+    </w:p>
+    <w:p>
+      <w:r>
         <w:t>Kathy Adamo of Grimes County, Texas, got an email that looked like it came from her pastor, asking for gift cards for church volunteers and telling her to keep it quiet. She lost $23,000, then got a fake "reimbursement" check her bank caught (KXXV). In Hanover, New Hampshire, a parishioner lost $2,000 (Valley News, Oct 8). In Tavares, Florida, members got texts asking for Macy's cards "for women with cancer" (WKMG, June). A Michigan pastor says "hundreds" of his members have been targeted.</w:t>
       </w:r>
     </w:p>
@@ -1865,6 +3007,340 @@
       <w:r>
         <w:rPr>
           <w:color w:val="000000"/>
+          <w:sz w:val="32"/>
+        </w:rPr>
+        <w:t>9. VETERANS: THIS POST CAN STEAL YOUR VA CHECK</w:t>
+      </w:r>
+    </w:p>
+    <w:p>
+      <w:r>
+        <w:rPr>
+          <w:b/>
+        </w:rPr>
+        <w:t>Slot:</w:t>
+      </w:r>
+      <w:r>
+        <w:t xml:space="preserve"> F2 C · </w:t>
+      </w:r>
+      <w:r>
+        <w:rPr>
+          <w:b/>
+        </w:rPr>
+        <w:t>Confidence: LOW</w:t>
+      </w:r>
+      <w:r>
+        <w:t xml:space="preserve"> · </w:t>
+      </w:r>
+      <w:r>
+        <w:rPr>
+          <w:i/>
+        </w:rPr>
+        <w:t>Fresh VA warning; no named victim, no news clip</w:t>
+      </w:r>
+    </w:p>
+    <w:p>
+      <w:r>
+        <w:rPr>
+          <w:b/>
+        </w:rPr>
+        <w:t>SLOT FIT:</w:t>
+      </w:r>
+      <w:r>
+        <w:t xml:space="preserve"> A C. Our audience includes many veterans, and the warning came out Oct 14. But it rests on one VA blog post: no count of victims, no named veteran, no local news.</w:t>
+      </w:r>
+    </w:p>
+    <w:p>
+      <w:pPr>
+        <w:pStyle w:val="Heading3"/>
+      </w:pPr>
+      <w:r>
+        <w:rPr>
+          <w:color w:val="333333"/>
+          <w:sz w:val="22"/>
+        </w:rPr>
+        <w:t>WORKING TEASE</w:t>
+      </w:r>
+    </w:p>
+    <w:p>
+      <w:pPr>
+        <w:spacing w:before="80" w:after="120"/>
+        <w:ind w:left="432"/>
+      </w:pPr>
+      <w:r>
+        <w:rPr>
+          <w:i/>
+        </w:rPr>
+        <w:t>VETERANS, LISTEN UP. A "GRANT" FOR VETERANS AND RETIREES. IT LOOKS LIKE A GOVERNMENT OFFICIAL IS BACKING IT. ALL THEY NEED IS YOUR DIRECT DEPOSIT INFO. THE VA SAYS VETERANS HAVE LOST THOUSANDS. THEIR BENEFITS WENT STRAIGHT TO SCAMMERS.</w:t>
+      </w:r>
+    </w:p>
+    <w:p>
+      <w:pPr>
+        <w:pStyle w:val="Heading3"/>
+      </w:pPr>
+      <w:r>
+        <w:rPr>
+          <w:color w:val="333333"/>
+          <w:sz w:val="22"/>
+        </w:rPr>
+        <w:t>THE HOOK</w:t>
+      </w:r>
+    </w:p>
+    <w:p>
+      <w:r>
+        <w:t>On Oct 14 the VA warned about a fake "Veterans &amp; Retired Seniors Grant Program" on Facebook, made to look like a government official was behind it. Veterans who answered gave up their direct-deposit details, and the VA says "a number of Veterans" lost "thousands of dollars." The VA says it's "working quickly to make each affected Veteran whole" (VA News). VA calls it "deepfake phishing," but describes a fake post, not a video.</w:t>
+      </w:r>
+    </w:p>
+    <w:p>
+      <w:pPr>
+        <w:pStyle w:val="Heading3"/>
+      </w:pPr>
+      <w:r>
+        <w:rPr>
+          <w:color w:val="333333"/>
+          <w:sz w:val="22"/>
+        </w:rPr>
+        <w:t>FOOTAGE — BE HONEST ABOUT THIS</w:t>
+      </w:r>
+    </w:p>
+    <w:p>
+      <w:pPr>
+        <w:pStyle w:val="ListBullet"/>
+        <w:spacing w:after="40"/>
+      </w:pPr>
+      <w:r>
+        <w:t>No local news clip. The VA's own "Fraud Prevention Video - Payment Redirect" (about 15K views; observed 10/19) is the only video.</w:t>
+      </w:r>
+    </w:p>
+    <w:p>
+      <w:pPr>
+        <w:pStyle w:val="ListBullet"/>
+        <w:spacing w:after="40"/>
+      </w:pPr>
+      <w:r>
+        <w:t>Otherwise it's Jeff and a screen-share of the VA warning.</w:t>
+      </w:r>
+    </w:p>
+    <w:p>
+      <w:pPr>
+        <w:pStyle w:val="Heading3"/>
+      </w:pPr>
+      <w:r>
+        <w:rPr>
+          <w:color w:val="333333"/>
+          <w:sz w:val="22"/>
+        </w:rPr>
+        <w:t>THE PAYOFF</w:t>
+      </w:r>
+    </w:p>
+    <w:p>
+      <w:pPr>
+        <w:pStyle w:val="ListBullet"/>
+        <w:spacing w:after="40"/>
+      </w:pPr>
+      <w:r>
+        <w:rPr>
+          <w:b/>
+        </w:rPr>
+        <w:t>The VA never asks for your direct-deposit details through a Facebook post or a "grant."</w:t>
+      </w:r>
+    </w:p>
+    <w:p>
+      <w:pPr>
+        <w:pStyle w:val="ListBullet"/>
+        <w:spacing w:after="40"/>
+      </w:pPr>
+      <w:r>
+        <w:t>Odd activity on your payments? Call the VA at 1-800-827-1000.</w:t>
+      </w:r>
+    </w:p>
+    <w:p>
+      <w:pPr>
+        <w:pStyle w:val="ListBullet"/>
+        <w:spacing w:after="40"/>
+      </w:pPr>
+      <w:r>
+        <w:t>Report it to VSAFE: 1-833-38V-SAFE (vsafe.gov).</w:t>
+      </w:r>
+    </w:p>
+    <w:p>
+      <w:r>
+        <w:br w:type="page"/>
+      </w:r>
+    </w:p>
+    <w:p>
+      <w:pPr>
+        <w:pStyle w:val="Heading1"/>
+      </w:pPr>
+      <w:r>
+        <w:rPr>
+          <w:color w:val="000000"/>
+          <w:sz w:val="32"/>
+        </w:rPr>
+        <w:t>10. AMAZON IS SENDING REAL REFUNDS. SCAMMERS ARE SENDING FAKE ONES</w:t>
+      </w:r>
+    </w:p>
+    <w:p>
+      <w:r>
+        <w:rPr>
+          <w:b/>
+        </w:rPr>
+        <w:t>Slot:</w:t>
+      </w:r>
+      <w:r>
+        <w:t xml:space="preserve"> F2 C · </w:t>
+      </w:r>
+      <w:r>
+        <w:rPr>
+          <w:b/>
+        </w:rPr>
+        <w:t>Confidence: LOW</w:t>
+      </w:r>
+      <w:r>
+        <w:t xml:space="preserve"> · </w:t>
+      </w:r>
+      <w:r>
+        <w:rPr>
+          <w:i/>
+        </w:rPr>
+        <w:t>Good service; possible repeat of 10/16</w:t>
+      </w:r>
+    </w:p>
+    <w:p>
+      <w:r>
+        <w:rPr>
+          <w:b/>
+        </w:rPr>
+        <w:t>SLOT FIT:</w:t>
+      </w:r>
+      <w:r>
+        <w:t xml:space="preserve"> A C, and good news to end on. But the 10/14 pitch sent the settlement to the 10/16 F1. The 10/16 description doesn't mention it, but I couldn't check the transcript. If it aired, this is dead.</w:t>
+      </w:r>
+    </w:p>
+    <w:p>
+      <w:pPr>
+        <w:pStyle w:val="Heading3"/>
+      </w:pPr>
+      <w:r>
+        <w:rPr>
+          <w:color w:val="333333"/>
+          <w:sz w:val="22"/>
+        </w:rPr>
+        <w:t>WORKING TEASE</w:t>
+      </w:r>
+    </w:p>
+    <w:p>
+      <w:pPr>
+        <w:spacing w:before="80" w:after="120"/>
+        <w:ind w:left="432"/>
+      </w:pPr>
+      <w:r>
+        <w:rPr>
+          <w:i/>
+        </w:rPr>
+        <w:t>IF YOU HAVE PRIME, AMAZON MAY OWE YOU UP TO 200 DOLLARS. IT'S REAL. BUT SCAMMERS ARE SENDING FAKE ONES TOO. THE REAL ONE SHOWS UP ON ITS OWN. THE FAKE ONE WANTS SOMETHING FROM YOU.</w:t>
+      </w:r>
+    </w:p>
+    <w:p>
+      <w:pPr>
+        <w:pStyle w:val="Heading3"/>
+      </w:pPr>
+      <w:r>
+        <w:rPr>
+          <w:color w:val="333333"/>
+          <w:sz w:val="22"/>
+        </w:rPr>
+        <w:t>THE HOOK</w:t>
+      </w:r>
+    </w:p>
+    <w:p>
+      <w:r>
+        <w:t>The FTC says payments from Amazon's Prime settlement go out automatically from Oct 1, up to $200, by PayPal, Venmo or check, with no claim form (FTC, Sept 17). Payments expire 60 days after they're sent. KSL warns scammers may send "click here for your refund" links that install malware, and anyone asking you to do something to "release" the money is a red flag (Sept 30). No victims found.</w:t>
+      </w:r>
+    </w:p>
+    <w:p>
+      <w:pPr>
+        <w:pStyle w:val="Heading3"/>
+      </w:pPr>
+      <w:r>
+        <w:rPr>
+          <w:color w:val="333333"/>
+          <w:sz w:val="22"/>
+        </w:rPr>
+        <w:t>FOOTAGE — BE HONEST ABOUT THIS</w:t>
+      </w:r>
+    </w:p>
+    <w:p>
+      <w:pPr>
+        <w:pStyle w:val="ListBullet"/>
+        <w:spacing w:after="40"/>
+      </w:pPr>
+      <w:r>
+        <w:t>KSL "Amazon Prime refunds are coming. Scammers may be, too" (about 5K views; observed 10/19). KSDK VERIFY (under 1K).</w:t>
+      </w:r>
+    </w:p>
+    <w:p>
+      <w:pPr>
+        <w:pStyle w:val="ListBullet"/>
+        <w:spacing w:after="40"/>
+      </w:pPr>
+      <w:r>
+        <w:t>Mostly Jeff and the FTC refund page.</w:t>
+      </w:r>
+    </w:p>
+    <w:p>
+      <w:pPr>
+        <w:pStyle w:val="Heading3"/>
+      </w:pPr>
+      <w:r>
+        <w:rPr>
+          <w:color w:val="333333"/>
+          <w:sz w:val="22"/>
+        </w:rPr>
+        <w:t>THE PAYOFF</w:t>
+      </w:r>
+    </w:p>
+    <w:p>
+      <w:pPr>
+        <w:pStyle w:val="ListBullet"/>
+        <w:spacing w:after="40"/>
+      </w:pPr>
+      <w:r>
+        <w:rPr>
+          <w:b/>
+        </w:rPr>
+        <w:t>A real refund never asks for a fee, a password or a form.</w:t>
+      </w:r>
+    </w:p>
+    <w:p>
+      <w:pPr>
+        <w:pStyle w:val="ListBullet"/>
+        <w:spacing w:after="40"/>
+      </w:pPr>
+      <w:r>
+        <w:t>Cash your check or accept the PayPal or Venmo payment within 60 days.</w:t>
+      </w:r>
+    </w:p>
+    <w:p>
+      <w:pPr>
+        <w:pStyle w:val="ListBullet"/>
+        <w:spacing w:after="40"/>
+      </w:pPr>
+      <w:r>
+        <w:t>Questions: ftc.gov/enforcement/refunds/amazon-refunds.</w:t>
+      </w:r>
+    </w:p>
+    <w:p>
+      <w:r>
+        <w:br w:type="page"/>
+      </w:r>
+    </w:p>
+    <w:p>
+      <w:pPr>
+        <w:pStyle w:val="Heading1"/>
+      </w:pPr>
+      <w:r>
+        <w:rPr>
+          <w:color w:val="000000"/>
         </w:rPr>
         <w:t>RESEARCH SOURCES &amp; VERIFICATION FLAGS</w:t>
       </w:r>
@@ -2229,7 +3705,7 @@
           <w:color w:val="333333"/>
           <w:sz w:val="22"/>
         </w:rPr>
-        <w:t>STORY 3 — MYCHART "MEDICARE KIT"</w:t>
+        <w:t>STORY 3 — FAKE KIDNAPPING CALLS</w:t>
       </w:r>
     </w:p>
     <w:p>
@@ -2246,7 +3722,7 @@
         <w:spacing w:after="40"/>
       </w:pPr>
       <w:r>
-        <w:t>How it works, and what to do if you paid (Denver Health, Oct 9, 2026).</w:t>
+        <w:t>Deborah Del Mastro, Martinez, CA, Navy veteran: a cloned voice of daughter Sarah; she followed orders for about 5 hours and wired $5,400 to Mexico (ABC7, May 24, 2026). Fox News CyberGuy (Oct 7, 2026): about 5.5 hours, a $20K demand, $5,400 in four MoneyGram/Western Union transfers starting at a Walmart; told to keep the phone charged; yelled at when she muted the call.</w:t>
       </w:r>
     </w:p>
     <w:p>
@@ -2255,7 +3731,7 @@
         <w:spacing w:after="40"/>
       </w:pPr>
       <w:r>
-        <w:t>Epic's Trevor Berceau: scammers are "taking advantage of the popularity of the MyChart brand." It's not a breach (Healthcare Dive, Aug 24, 2026).</w:t>
+        <w:t>Victoria Bond, Livingston, MT: lost more than $2,000 by Western Union at an Albertsons during a call of about an hour; FBI agent Jason Grende: "try to get off the line" (MontanaRightNow, Aug 4, 2026).</w:t>
       </w:r>
     </w:p>
     <w:p>
@@ -2264,34 +3740,7 @@
         <w:spacing w:after="40"/>
       </w:pPr>
       <w:r>
-        <w:t>PA AG Dave Sunday, Aug 28, 2026: no such kit exists.</w:t>
-      </w:r>
-    </w:p>
-    <w:p>
-      <w:pPr>
-        <w:pStyle w:val="ListBullet"/>
-        <w:spacing w:after="40"/>
-      </w:pPr>
-      <w:r>
-        <w:t>The $9.95 / $29.95 quote comes from an Indiana complainant, age 50 to 59, in an FTC complaint Gizmodo got through a records request (Gizmodo, Sept 8, 2026).</w:t>
-      </w:r>
-    </w:p>
-    <w:p>
-      <w:pPr>
-        <w:pStyle w:val="ListBullet"/>
-        <w:spacing w:after="40"/>
-      </w:pPr>
-      <w:r>
-        <w:t>"41 health systems" comes from AHCJ (Sept 16, 2026), citing Becker's.</w:t>
-      </w:r>
-    </w:p>
-    <w:p>
-      <w:pPr>
-        <w:pStyle w:val="ListBullet"/>
-        <w:spacing w:after="40"/>
-      </w:pPr>
-      <w:r>
-        <w:t>CBS Philadelphia clip, 169,755 views; NBC10 Philadelphia, 12,154 (YouTube search, observed Oct 19).</w:t>
+        <w:t>FBI IC3 PSA, Dec 5, 2025: altered "proof of life" photos and videos in virtual kidnappings.</w:t>
       </w:r>
     </w:p>
     <w:p>
@@ -2302,7 +3751,7 @@
         <w:t>Sources:</w:t>
       </w:r>
       <w:r>
-        <w:t xml:space="preserve"> denverhealth.org/news/2026/10/beware-fake-mychart-emails · healthcaredive.com/news/health-systems-warn-patients-of-mychart-phishing-scam/828597/ · attorneygeneral.gov/taking-action/ag-sunday-warns-pennsylvanians-of-phishing-scam-targeting-mychart-patient-portal-users/ · gizmodo.com/that-free-mychart-medicare-kit-is-a-scam-2000805167 · healthjournalism.org/blog/2026/09/mychart-phishing-scam/ · youtube.com/watch?v=vATdvkX57eU · youtube.com/watch?v=BO59Vj2ExE8</w:t>
+        <w:t xml:space="preserve"> abc7news.com/post/bay-area-mom-thousands-scammers-use-ai-mimic-daughters-voice-fake-kidnapping-part-growing-trend/19154381/ · foxnews.com/tech/ai-voice-scam-traps-mom-5-hour-kidnapping-nightmare · montanarightnow.com/bozeman/help-me-ben-livingston-woman-warns-others-after-losing-2-000-in-virtual-kidnapping-scam/ · ic3.gov/PSA/2025/PSA251205</w:t>
       </w:r>
     </w:p>
     <w:p>
@@ -2325,10 +3774,10 @@
         <w:rPr>
           <w:b/>
         </w:rPr>
-        <w:t>"41 health systems" is in the tease, and I couldn't load Becker's (blocked).</w:t>
-      </w:r>
-      <w:r>
-        <w:t xml:space="preserve"> It's confirmed only by outlets citing Becker's. Load it in a browser, or say "dozens."</w:t>
+        <w:t>"Her daughter's voice, screaming" is the beat, and it's voice cloning: on the dead list since May 13.</w:t>
+      </w:r>
+      <w:r>
+        <w:t xml:space="preserve"> Only pitch it on what's new (the hours on the line, the errands). Needs Jeff's ruling.</w:t>
       </w:r>
     </w:p>
     <w:p>
@@ -2337,7 +3786,16 @@
         <w:spacing w:after="40"/>
       </w:pPr>
       <w:r>
-        <w:t>⚠️ The $9.95 victim is 50 to 59 per Gizmodo. Money Talks News says "in their 70s." Don't use the 70s.</w:t>
+        <w:t xml:space="preserve">🚨 </w:t>
+      </w:r>
+      <w:r>
+        <w:rPr>
+          <w:b/>
+        </w:rPr>
+        <w:t>Faked photo/video proof of life is only an FBI warning.</w:t>
+      </w:r>
+      <w:r>
+        <w:t xml:space="preserve"> No 2026 victim we found received one. Don't say it happened to anyone.</w:t>
       </w:r>
     </w:p>
     <w:p>
@@ -2346,7 +3804,7 @@
         <w:spacing w:after="40"/>
       </w:pPr>
       <w:r>
-        <w:t>⚠️ The viewer tip: the email came from Danny Byers and was signed Kate Byers. Confirm who she is and get permission for the screenshots. Not loaded; from the story finder.</w:t>
+        <w:t>⚠️ Del Mastro's age isn't stated anywhere. ABC News/GMA says "San Francisco" and names the daughter "Sarah Donalds," which conflicts with ABC7. Fox mentions Senate testimony I couldn't confirm.</w:t>
       </w:r>
     </w:p>
     <w:p>
@@ -2355,16 +3813,7 @@
         <w:spacing w:after="40"/>
       </w:pPr>
       <w:r>
-        <w:t>⚠️ It's unclear whether the CBS Philadelphia clip covers the kit or the "test results" version.</w:t>
-      </w:r>
-    </w:p>
-    <w:p>
-      <w:pPr>
-        <w:pStyle w:val="ListBullet"/>
-        <w:spacing w:after="40"/>
-      </w:pPr>
-      <w:r>
-        <w:t>⚠️ Collision: the Oct 9 Medicare show is 19 days earlier. Jeff has called Medicare "maybe too niche for an A."</w:t>
+        <w:t>⚠️ Caller ID showing the daughter's real number comes from the Missouri "Rachel" case (WDAM, Mar 5, 2026; KPTV, Jan 23, 2026), a 2025 incident re-reported this year. Date it if used.</w:t>
       </w:r>
     </w:p>
     <w:p>
@@ -2376,7 +3825,7 @@
           <w:color w:val="333333"/>
           <w:sz w:val="22"/>
         </w:rPr>
-        <w:t>STORY 4 — RENTAL CAR DAMAGE BILLS</w:t>
+        <w:t>STORY 4 — "CARD DECLINED" DOUBLE CHARGE</w:t>
       </w:r>
     </w:p>
     <w:p>
@@ -2393,7 +3842,7 @@
         <w:spacing w:after="40"/>
       </w:pPr>
       <w:r>
-        <w:t>Hope Orr, Draper, UT: $165 smoking charge and a planned $500 tire charge. A reverse image search found the photo in a Reddit post "from years ago," showing a different car model. The host texted "I've done more than 5,000 tire claims in the last nine years." Turo refunded her in full and banned the host (KSL, Oct 5, 2026).</w:t>
+        <w:t>NPR, Oct 14, 2026 (Caley Fox Shannon, Monika Evstatieva): Mazal Group of Chatsworth, CA, behind dozens of brands (Voupre, Lionesse, Orogold, Vine Vera) in what a former employee estimates are at least 2,000 stores. Verbatim: "In police reports, others allege a store employee told them their card declined when it had not and charged a second card as well."</w:t>
       </w:r>
     </w:p>
     <w:p>
@@ -2402,7 +3851,7 @@
         <w:spacing w:after="40"/>
       </w:pPr>
       <w:r>
-        <w:t>Sheilah Williams, 70, $2,000 Enterprise hail bill, dropped (KMOV, July 1, 2026). Jessica Fields, Hertz, $350, sent to collections, closed after 10 months (InvestigateTV, June 29, 2026).</w:t>
+        <w:t>Santa Fe, unnamed woman, 67: agreed to $600; "The salesperson said her credit card was declined, so she provided another"; "two charges totaling $44,280."</w:t>
       </w:r>
     </w:p>
     <w:p>
@@ -2411,7 +3860,16 @@
         <w:spacing w:after="40"/>
       </w:pPr>
       <w:r>
-        <w:t>Hertz uses UVeye AI scanners and says more than 97% of scans find no billable damage (FOX 26, Aug 20, 2025).</w:t>
+        <w:t>Mary Ellen Eckhert, 82, $53,500 across four cards; an unnamed Michigan man with dementia, $42,000; Mary Lee, 65, nearly $19,000.</w:t>
+      </w:r>
+    </w:p>
+    <w:p>
+      <w:pPr>
+        <w:pStyle w:val="ListBullet"/>
+        <w:spacing w:after="40"/>
+      </w:pPr>
+      <w:r>
+        <w:t>Mazal, through its lawyer: "does not own or operate any retail locations."</w:t>
       </w:r>
     </w:p>
     <w:p>
@@ -2422,7 +3880,7 @@
         <w:t>Sources:</w:t>
       </w:r>
       <w:r>
-        <w:t xml:space="preserve"> ksl.com/article/51632567/draper-woman-fights-to-get-turo-host-booted-after-making-fraudulent-rental-car-damage-claims-against-her · firstalert4.com/2026/07/01/rental-car-damage-bill-shock-how-protect-yourself-incorrect-bills-before-you-drive-off/ · investigatetv.com/2026/06/29/rental-car-ai-scanners-flag-alleged-damage-leaving-customers-with-surprise-bills/ · fox26houston.com/news/rental-cars-using-ai-damage-hertz-billing</w:t>
+        <w:t xml:space="preserve"> npr.org/2026/10/14/nx-s1-5550974/skincare-scheme-mazal-group-investigation · npr.org/2026/10/14/nx-s1-6000621/mazal-group-investigation-documentary · kpbs.org/news/economy/2026/10/14/the-skincare-scheme-that-led-to-consumer-complaints-lawsuits-and-a-federal-investigation</w:t>
       </w:r>
     </w:p>
     <w:p>
@@ -2445,10 +3903,10 @@
         <w:rPr>
           <w:b/>
         </w:rPr>
-        <w:t>"5,000 tire claims" is the host's own boast in a text, unverified by KSL or Turo.</w:t>
-      </w:r>
-      <w:r>
-        <w:t xml:space="preserve"> Say "he texted her he'd filed."</w:t>
+        <w:t>"They charged both" is an allegation in police reports, quoted by NPR.</w:t>
+      </w:r>
+      <w:r>
+        <w:t xml:space="preserve"> Say "shoppers allege" or "police reports say." Mazal denies running the stores.</w:t>
       </w:r>
     </w:p>
     <w:p>
@@ -2457,7 +3915,16 @@
         <w:spacing w:after="40"/>
       </w:pPr>
       <w:r>
-        <w:t>⚠️ KSL says "years ago," not "4 years." The tease says "years ago."</w:t>
+        <w:t xml:space="preserve">🚨 </w:t>
+      </w:r>
+      <w:r>
+        <w:rPr>
+          <w:b/>
+        </w:rPr>
+        <w:t>Collision:</w:t>
+      </w:r>
+      <w:r>
+        <w:t xml:space="preserve"> the 10/14 A was mall skincare. It only works as a follow-up. NPR doesn't tie Bee &amp; Co to Mazal, so don't link them on air.</w:t>
       </w:r>
     </w:p>
     <w:p>
@@ -2466,7 +3933,7 @@
         <w:spacing w:after="40"/>
       </w:pPr>
       <w:r>
-        <w:t>⚠️ Ryan's rule: no one here ended up out of pocket. Lead with the Reddit photo, not a loss.</w:t>
+        <w:t>⚠️ "Thousands of stores" is a former employee's estimate. NPR's wording: "dozens of brands sold in thousands of stores."</w:t>
       </w:r>
     </w:p>
     <w:p>
@@ -2475,7 +3942,16 @@
         <w:spacing w:after="40"/>
       </w:pPr>
       <w:r>
-        <w:t>⚠️ The KSL clip's 539K views and its upload date are unconfirmed. The resort-fee item (Hilton $75) is unsourced and stays out.</w:t>
+        <w:t>⚠️ The story finder's "fake online stores then call for your card" variant has no 2026 source. Left out.</w:t>
+      </w:r>
+    </w:p>
+    <w:p>
+      <w:pPr>
+        <w:pStyle w:val="ListBullet"/>
+        <w:spacing w:after="40"/>
+      </w:pPr>
+      <w:r>
+        <w:t>⚠️ NPR's film is on NPR's site, not YouTube; using it needs NPR's permission. The 1.7M TikTok is unverified.</w:t>
       </w:r>
     </w:p>
     <w:p>
@@ -2487,7 +3963,7 @@
           <w:color w:val="333333"/>
           <w:sz w:val="22"/>
         </w:rPr>
-        <w:t>STORY 5 — PASTOR GIFT-CARD TEXTS</w:t>
+        <w:t>STORY 5 — MYCHART "MEDICARE KIT"</w:t>
       </w:r>
     </w:p>
     <w:p>
@@ -2504,7 +3980,7 @@
         <w:spacing w:after="40"/>
       </w:pPr>
       <w:r>
-        <w:t>Kathy Adamo, Grimes County, TX, lost $23,000; Sheriff Don Sowell: "Wish she'd have called me or somebody" (KXXV; page date blank).</w:t>
+        <w:t>How it works, and what to do if you paid (Denver Health, Oct 9, 2026).</w:t>
       </w:r>
     </w:p>
     <w:p>
@@ -2513,7 +3989,7 @@
         <w:spacing w:after="40"/>
       </w:pPr>
       <w:r>
-        <w:t>Hanover, NH parishioner lost $2,000 (Valley News, Oct 8, 2026). Tavares, FL texts asking for Macy's cards "for women with cancer," and one person lost money (WKMG, June 26, 2026). Catawba Co., NC, Rev. Doug Hefner: "usually it's people who are elderly" (WSOC, Aug 27, 2026).</w:t>
+        <w:t>Epic's Trevor Berceau: scammers are "taking advantage of the popularity of the MyChart brand." It's not a breach (Healthcare Dive, Aug 24, 2026).</w:t>
       </w:r>
     </w:p>
     <w:p>
@@ -2522,7 +3998,34 @@
         <w:spacing w:after="40"/>
       </w:pPr>
       <w:r>
-        <w:t>FTC, Sept 17, 2024: a faith leader "won't ask you to buy gift cards."</w:t>
+        <w:t>PA AG Dave Sunday, Aug 28, 2026: no such kit exists.</w:t>
+      </w:r>
+    </w:p>
+    <w:p>
+      <w:pPr>
+        <w:pStyle w:val="ListBullet"/>
+        <w:spacing w:after="40"/>
+      </w:pPr>
+      <w:r>
+        <w:t>The $9.95 / $29.95 quote comes from an Indiana complainant, age 50 to 59, in an FTC complaint Gizmodo got through a records request (Gizmodo, Sept 8, 2026).</w:t>
+      </w:r>
+    </w:p>
+    <w:p>
+      <w:pPr>
+        <w:pStyle w:val="ListBullet"/>
+        <w:spacing w:after="40"/>
+      </w:pPr>
+      <w:r>
+        <w:t>"41 health systems" comes from AHCJ (Sept 16, 2026), citing Becker's.</w:t>
+      </w:r>
+    </w:p>
+    <w:p>
+      <w:pPr>
+        <w:pStyle w:val="ListBullet"/>
+        <w:spacing w:after="40"/>
+      </w:pPr>
+      <w:r>
+        <w:t>CBS Philadelphia clip, 169,755 views; NBC10 Philadelphia, 12,154 (YouTube search, observed Oct 19).</w:t>
       </w:r>
     </w:p>
     <w:p>
@@ -2533,7 +4036,7 @@
         <w:t>Sources:</w:t>
       </w:r>
       <w:r>
-        <w:t xml:space="preserve"> kxxv.com/news/local-news/in-your-neighborhood/grimes-county/grimes-county-woman-loses-23-000-after-scammer-impersonates-her-pastor-via-email · vnews.com/2026/10/08/st-thomas-church-phishing-scam/ · clickorlando.com/news/local/2026/06/26/tavares-police-warn-of-scam-texts-impersonating-local-pastor-targeting-church-members-for-gift-cards/ · consumer.ftc.gov/consumer-alerts/2024/09/gift-card-helping-your-congregation-or-paying-scammer</w:t>
+        <w:t xml:space="preserve"> denverhealth.org/news/2026/10/beware-fake-mychart-emails · healthcaredive.com/news/health-systems-warn-patients-of-mychart-phishing-scam/828597/ · attorneygeneral.gov/taking-action/ag-sunday-warns-pennsylvanians-of-phishing-scam-targeting-mychart-patient-portal-users/ · gizmodo.com/that-free-mychart-medicare-kit-is-a-scam-2000805167 · healthjournalism.org/blog/2026/09/mychart-phishing-scam/ · youtube.com/watch?v=vATdvkX57eU · youtube.com/watch?v=BO59Vj2ExE8</w:t>
       </w:r>
     </w:p>
     <w:p>
@@ -2556,10 +4059,10 @@
         <w:rPr>
           <w:b/>
         </w:rPr>
-        <w:t>The Adamo story has no date on the page</w:t>
-      </w:r>
-      <w:r>
-        <w:t xml:space="preserve"> (a syndicated copy's URL suggests Sept 11, 2026, not loaded). Confirm it's this year before "$23,000" leads the tease.</w:t>
+        <w:t>"41 health systems" is in the tease, and I couldn't load Becker's (blocked).</w:t>
+      </w:r>
+      <w:r>
+        <w:t xml:space="preserve"> It's confirmed only by outlets citing Becker's. Load it in a browser, or say "dozens."</w:t>
       </w:r>
     </w:p>
     <w:p>
@@ -2568,7 +4071,7 @@
         <w:spacing w:after="40"/>
       </w:pPr>
       <w:r>
-        <w:t>⚠️ Adamo's was an email, not a text, and "for women with cancer" is the Tavares case. The tease keeps them separate. Don't merge them in the bible.</w:t>
+        <w:t>⚠️ The $9.95 victim is 50 to 59 per Gizmodo. Money Talks News says "in their 70s." Don't use the 70s.</w:t>
       </w:r>
     </w:p>
     <w:p>
@@ -2577,7 +4080,553 @@
         <w:spacing w:after="40"/>
       </w:pPr>
       <w:r>
+        <w:t>⚠️ The viewer tip: the email came from Danny Byers and was signed Kate Byers. Confirm who she is and get permission for the screenshots. Not loaded; from the story finder.</w:t>
+      </w:r>
+    </w:p>
+    <w:p>
+      <w:pPr>
+        <w:pStyle w:val="ListBullet"/>
+        <w:spacing w:after="40"/>
+      </w:pPr>
+      <w:r>
+        <w:t>⚠️ It's unclear whether the CBS Philadelphia clip covers the kit or the "test results" version.</w:t>
+      </w:r>
+    </w:p>
+    <w:p>
+      <w:pPr>
+        <w:pStyle w:val="ListBullet"/>
+        <w:spacing w:after="40"/>
+      </w:pPr>
+      <w:r>
+        <w:t>⚠️ Collision: the Oct 9 Medicare show is 19 days earlier. Jeff has called Medicare "maybe too niche for an A."</w:t>
+      </w:r>
+    </w:p>
+    <w:p>
+      <w:pPr>
+        <w:pStyle w:val="Heading3"/>
+      </w:pPr>
+      <w:r>
+        <w:rPr>
+          <w:color w:val="333333"/>
+          <w:sz w:val="22"/>
+        </w:rPr>
+        <w:t>STORY 6 — RENTAL CAR DAMAGE BILLS</w:t>
+      </w:r>
+    </w:p>
+    <w:p>
+      <w:r>
+        <w:rPr>
+          <w:b/>
+        </w:rPr>
+        <w:t>Confirmed:</w:t>
+      </w:r>
+    </w:p>
+    <w:p>
+      <w:pPr>
+        <w:pStyle w:val="ListBullet"/>
+        <w:spacing w:after="40"/>
+      </w:pPr>
+      <w:r>
+        <w:t>Hope Orr, Draper, UT: $165 smoking charge and a planned $500 tire charge. A reverse image search found the photo in a Reddit post "from years ago," showing a different car model. The host texted "I've done more than 5,000 tire claims in the last nine years." Turo refunded her in full and banned the host (KSL, Oct 5, 2026).</w:t>
+      </w:r>
+    </w:p>
+    <w:p>
+      <w:pPr>
+        <w:pStyle w:val="ListBullet"/>
+        <w:spacing w:after="40"/>
+      </w:pPr>
+      <w:r>
+        <w:t>Sheilah Williams, 70, $2,000 Enterprise hail bill, dropped (KMOV, July 1, 2026). Jessica Fields, Hertz, $350, sent to collections, closed after 10 months (InvestigateTV, June 29, 2026).</w:t>
+      </w:r>
+    </w:p>
+    <w:p>
+      <w:pPr>
+        <w:pStyle w:val="ListBullet"/>
+        <w:spacing w:after="40"/>
+      </w:pPr>
+      <w:r>
+        <w:t>Hertz uses UVeye AI scanners and says more than 97% of scans find no billable damage (FOX 26, Aug 20, 2025).</w:t>
+      </w:r>
+    </w:p>
+    <w:p>
+      <w:r>
+        <w:rPr>
+          <w:b/>
+        </w:rPr>
+        <w:t>Sources:</w:t>
+      </w:r>
+      <w:r>
+        <w:t xml:space="preserve"> ksl.com/article/51632567/draper-woman-fights-to-get-turo-host-booted-after-making-fraudulent-rental-car-damage-claims-against-her · firstalert4.com/2026/07/01/rental-car-damage-bill-shock-how-protect-yourself-incorrect-bills-before-you-drive-off/ · investigatetv.com/2026/06/29/rental-car-ai-scanners-flag-alleged-damage-leaving-customers-with-surprise-bills/ · fox26houston.com/news/rental-cars-using-ai-damage-hertz-billing</w:t>
+      </w:r>
+    </w:p>
+    <w:p>
+      <w:r>
+        <w:rPr>
+          <w:b/>
+        </w:rPr>
+        <w:t>NEEDS VERIFICATION:</w:t>
+      </w:r>
+    </w:p>
+    <w:p>
+      <w:pPr>
+        <w:pStyle w:val="ListBullet"/>
+        <w:spacing w:after="40"/>
+      </w:pPr>
+      <w:r>
+        <w:t xml:space="preserve">🚨 </w:t>
+      </w:r>
+      <w:r>
+        <w:rPr>
+          <w:b/>
+        </w:rPr>
+        <w:t>"5,000 tire claims" is the host's own boast in a text, unverified by KSL or Turo.</w:t>
+      </w:r>
+      <w:r>
+        <w:t xml:space="preserve"> Say "he texted her he'd filed."</w:t>
+      </w:r>
+    </w:p>
+    <w:p>
+      <w:pPr>
+        <w:pStyle w:val="ListBullet"/>
+        <w:spacing w:after="40"/>
+      </w:pPr>
+      <w:r>
+        <w:t>⚠️ KSL says "years ago," not "4 years." The tease says "years ago."</w:t>
+      </w:r>
+    </w:p>
+    <w:p>
+      <w:pPr>
+        <w:pStyle w:val="ListBullet"/>
+        <w:spacing w:after="40"/>
+      </w:pPr>
+      <w:r>
+        <w:t>⚠️ Ryan's rule: no one here ended up out of pocket. Lead with the Reddit photo, not a loss.</w:t>
+      </w:r>
+    </w:p>
+    <w:p>
+      <w:pPr>
+        <w:pStyle w:val="ListBullet"/>
+        <w:spacing w:after="40"/>
+      </w:pPr>
+      <w:r>
+        <w:t>⚠️ The KSL clip's 539K views and its upload date are unconfirmed. The resort-fee item (Hilton $75) is unsourced and stays out.</w:t>
+      </w:r>
+    </w:p>
+    <w:p>
+      <w:pPr>
+        <w:pStyle w:val="Heading3"/>
+      </w:pPr>
+      <w:r>
+        <w:rPr>
+          <w:color w:val="333333"/>
+          <w:sz w:val="22"/>
+        </w:rPr>
+        <w:t>STORY 7 — $2 WATER QR CODE</w:t>
+      </w:r>
+    </w:p>
+    <w:p>
+      <w:r>
+        <w:rPr>
+          <w:b/>
+        </w:rPr>
+        <w:t>Confirmed:</w:t>
+      </w:r>
+    </w:p>
+    <w:p>
+      <w:pPr>
+        <w:pStyle w:val="ListBullet"/>
+        <w:spacing w:after="40"/>
+      </w:pPr>
+      <w:r>
+        <w:t>Monet Swann, Howard graduate, Oct 1, 2026, 10th St. and Techwood Dr., Midtown Atlanta: $1,200 by Zelle and $1,200 on Apple Pay; her bank hasn't refunded her; Atlanta police investigating (FOX 5 Atlanta, Oct 9, updated Oct 15).</w:t>
+      </w:r>
+    </w:p>
+    <w:p>
+      <w:pPr>
+        <w:pStyle w:val="ListBullet"/>
+        <w:spacing w:after="40"/>
+      </w:pPr>
+      <w:r>
+        <w:t>Quote via Daily Hodl, credited to 11Alive: "So, I screenshared and authorized a two-dollar purchase from Zelle and unfortunately, he took $1,200 from me."</w:t>
+      </w:r>
+    </w:p>
+    <w:p>
+      <w:pPr>
+        <w:pStyle w:val="ListBullet"/>
+        <w:spacing w:after="40"/>
+      </w:pPr>
+      <w:r>
+        <w:t>FTC consumer alert, Sept 3, 2026: fake QR stickers on parking meters.</w:t>
+      </w:r>
+    </w:p>
+    <w:p>
+      <w:r>
+        <w:rPr>
+          <w:b/>
+        </w:rPr>
+        <w:t>Sources:</w:t>
+      </w:r>
+      <w:r>
+        <w:t xml:space="preserve"> fox5atlanta.com/news/howard-graduate-scammed-out-2-4k-during-midtown-water-purchase · dailyhodl.com/2026/10/09/2400-abruptly-drained-from-georgia-womans-bank-account-after-she-purchases-2-bottle-of-water-from-street-vendor-report/ · consumer.ftc.gov/consumer-alerts/2026/09/see-qr-code-parked-somewhere-dont-scan-ityet</w:t>
+      </w:r>
+    </w:p>
+    <w:p>
+      <w:r>
+        <w:rPr>
+          <w:b/>
+        </w:rPr>
+        <w:t>NEEDS VERIFICATION:</w:t>
+      </w:r>
+    </w:p>
+    <w:p>
+      <w:pPr>
+        <w:pStyle w:val="ListBullet"/>
+        <w:spacing w:after="40"/>
+      </w:pPr>
+      <w:r>
+        <w:t xml:space="preserve">🚨 </w:t>
+      </w:r>
+      <w:r>
+        <w:rPr>
+          <w:b/>
+        </w:rPr>
+        <w:t>"The QR code took $2,400" is the headline, but the sourced mechanism is a screen share.</w:t>
+      </w:r>
+      <w:r>
+        <w:t xml:space="preserve"> No source says the QR led to a fake page. How the Apple Pay charge happened is unexplained. Get 11Alive's story before the title is locked.</w:t>
+      </w:r>
+    </w:p>
+    <w:p>
+      <w:pPr>
+        <w:pStyle w:val="ListBullet"/>
+        <w:spacing w:after="40"/>
+      </w:pPr>
+      <w:r>
+        <w:t>⚠️ Totals conflict: 11Alive's reporter posted $2,000; FOX 5's lede says "nearly $2,500." The itemized total is $2,400.</w:t>
+      </w:r>
+    </w:p>
+    <w:p>
+      <w:pPr>
+        <w:pStyle w:val="ListBullet"/>
+        <w:spacing w:after="40"/>
+      </w:pPr>
+      <w:r>
+        <w:t>⚠️ QR codes are banked "only with new material" (Jeff, Sep 4: "we also did fake QR code"). The bank refusing a "screen-shared" payment is the new part.</w:t>
+      </w:r>
+    </w:p>
+    <w:p>
+      <w:pPr>
+        <w:pStyle w:val="ListBullet"/>
+        <w:spacing w:after="40"/>
+      </w:pPr>
+      <w:r>
+        <w:t>⚠️ The 11Alive article and the YouTube clip's date and views couldn't be loaded.</w:t>
+      </w:r>
+    </w:p>
+    <w:p>
+      <w:pPr>
+        <w:pStyle w:val="Heading3"/>
+      </w:pPr>
+      <w:r>
+        <w:rPr>
+          <w:color w:val="333333"/>
+          <w:sz w:val="22"/>
+        </w:rPr>
+        <w:t>STORY 8 — PASTOR GIFT-CARD TEXTS</w:t>
+      </w:r>
+    </w:p>
+    <w:p>
+      <w:r>
+        <w:rPr>
+          <w:b/>
+        </w:rPr>
+        <w:t>Confirmed:</w:t>
+      </w:r>
+    </w:p>
+    <w:p>
+      <w:pPr>
+        <w:pStyle w:val="ListBullet"/>
+        <w:spacing w:after="40"/>
+      </w:pPr>
+      <w:r>
+        <w:t>Kathy Adamo, Grimes County, TX, lost $23,000; Sheriff Don Sowell: "Wish she'd have called me or somebody" (KXXV; page date blank).</w:t>
+      </w:r>
+    </w:p>
+    <w:p>
+      <w:pPr>
+        <w:pStyle w:val="ListBullet"/>
+        <w:spacing w:after="40"/>
+      </w:pPr>
+      <w:r>
+        <w:t>Hanover, NH parishioner lost $2,000 (Valley News, Oct 8, 2026). Tavares, FL texts asking for Macy's cards "for women with cancer," and one person lost money (WKMG, June 26, 2026). Catawba Co., NC, Rev. Doug Hefner: "usually it's people who are elderly" (WSOC, Aug 27, 2026).</w:t>
+      </w:r>
+    </w:p>
+    <w:p>
+      <w:pPr>
+        <w:pStyle w:val="ListBullet"/>
+        <w:spacing w:after="40"/>
+      </w:pPr>
+      <w:r>
+        <w:t>FTC, Sept 17, 2024: a faith leader "won't ask you to buy gift cards."</w:t>
+      </w:r>
+    </w:p>
+    <w:p>
+      <w:r>
+        <w:rPr>
+          <w:b/>
+        </w:rPr>
+        <w:t>Sources:</w:t>
+      </w:r>
+      <w:r>
+        <w:t xml:space="preserve"> kxxv.com/news/local-news/in-your-neighborhood/grimes-county/grimes-county-woman-loses-23-000-after-scammer-impersonates-her-pastor-via-email · vnews.com/2026/10/08/st-thomas-church-phishing-scam/ · clickorlando.com/news/local/2026/06/26/tavares-police-warn-of-scam-texts-impersonating-local-pastor-targeting-church-members-for-gift-cards/ · consumer.ftc.gov/consumer-alerts/2024/09/gift-card-helping-your-congregation-or-paying-scammer</w:t>
+      </w:r>
+    </w:p>
+    <w:p>
+      <w:r>
+        <w:rPr>
+          <w:b/>
+        </w:rPr>
+        <w:t>NEEDS VERIFICATION:</w:t>
+      </w:r>
+    </w:p>
+    <w:p>
+      <w:pPr>
+        <w:pStyle w:val="ListBullet"/>
+        <w:spacing w:after="40"/>
+      </w:pPr>
+      <w:r>
+        <w:t xml:space="preserve">🚨 </w:t>
+      </w:r>
+      <w:r>
+        <w:rPr>
+          <w:b/>
+        </w:rPr>
+        <w:t>The Adamo story has no date on the page</w:t>
+      </w:r>
+      <w:r>
+        <w:t xml:space="preserve"> (a syndicated copy's URL suggests Sept 11, 2026, not loaded). Confirm it's this year before "$23,000" leads the tease.</w:t>
+      </w:r>
+    </w:p>
+    <w:p>
+      <w:pPr>
+        <w:pStyle w:val="ListBullet"/>
+        <w:spacing w:after="40"/>
+      </w:pPr>
+      <w:r>
+        <w:t>⚠️ Adamo's was an email, not a text, and "for women with cancer" is the Tavares case. The tease keeps them separate. Don't merge them in the bible.</w:t>
+      </w:r>
+    </w:p>
+    <w:p>
+      <w:pPr>
+        <w:pStyle w:val="ListBullet"/>
+        <w:spacing w:after="40"/>
+      </w:pPr>
+      <w:r>
         <w:t>⚠️ No YouTube clip has been dated. The producer's 10/7 note said gift-card draining was covered before; this is a different story, but confirm.</w:t>
+      </w:r>
+    </w:p>
+    <w:p>
+      <w:pPr>
+        <w:pStyle w:val="Heading3"/>
+      </w:pPr>
+      <w:r>
+        <w:rPr>
+          <w:color w:val="333333"/>
+          <w:sz w:val="22"/>
+        </w:rPr>
+        <w:t>STORY 9 — VA BENEFITS REDIRECTED</w:t>
+      </w:r>
+    </w:p>
+    <w:p>
+      <w:r>
+        <w:rPr>
+          <w:b/>
+        </w:rPr>
+        <w:t>Confirmed:</w:t>
+      </w:r>
+    </w:p>
+    <w:p>
+      <w:pPr>
+        <w:pStyle w:val="ListBullet"/>
+        <w:spacing w:after="40"/>
+      </w:pPr>
+      <w:r>
+        <w:t>VA News, Oct 14, 2026, "Deepfake phishing: Don't be fooled": a fake "Veterans &amp; Retired Seniors Grant Program" on Facebook, made to look sponsored by a government official; "a number of Veterans" lost "thousands of dollars"; VA is "working quickly to make each affected Veteran whole."</w:t>
+      </w:r>
+    </w:p>
+    <w:p>
+      <w:pPr>
+        <w:pStyle w:val="ListBullet"/>
+        <w:spacing w:after="40"/>
+      </w:pPr>
+      <w:r>
+        <w:t>VBA newsletter, Oct 1, 2026: suspicious direct-deposit activity, call 1-800-827-1000.</w:t>
+      </w:r>
+    </w:p>
+    <w:p>
+      <w:pPr>
+        <w:pStyle w:val="ListBullet"/>
+        <w:spacing w:after="40"/>
+      </w:pPr>
+      <w:r>
+        <w:t>VSAFE: 1-833-38V-SAFE, vsafe.gov (va.gov/vsafe).</w:t>
+      </w:r>
+    </w:p>
+    <w:p>
+      <w:r>
+        <w:rPr>
+          <w:b/>
+        </w:rPr>
+        <w:t>Sources:</w:t>
+      </w:r>
+      <w:r>
+        <w:t xml:space="preserve"> news.va.gov/149747/deepfake-phishing-dont-be-fooled/ · content.govdelivery.com/accounts/USVAVBA/bulletins/42c780e · va.gov/vsafe/</w:t>
+      </w:r>
+    </w:p>
+    <w:p>
+      <w:r>
+        <w:rPr>
+          <w:b/>
+        </w:rPr>
+        <w:t>NEEDS VERIFICATION:</w:t>
+      </w:r>
+    </w:p>
+    <w:p>
+      <w:pPr>
+        <w:pStyle w:val="ListBullet"/>
+        <w:spacing w:after="40"/>
+      </w:pPr>
+      <w:r>
+        <w:t xml:space="preserve">🚨 </w:t>
+      </w:r>
+      <w:r>
+        <w:rPr>
+          <w:b/>
+        </w:rPr>
+        <w:t>The Samuel Marcus case (the story finder's seed) has nothing to do with veterans.</w:t>
+      </w:r>
+      <w:r>
+        <w:t xml:space="preserve"> He laundered money for romance, tax and business-email scams (PhillyVoice, Feb 9; Inquirer, Oct 16). Don't use him.</w:t>
+      </w:r>
+    </w:p>
+    <w:p>
+      <w:pPr>
+        <w:pStyle w:val="ListBullet"/>
+        <w:spacing w:after="40"/>
+      </w:pPr>
+      <w:r>
+        <w:t xml:space="preserve">🚨 </w:t>
+      </w:r>
+      <w:r>
+        <w:rPr>
+          <w:b/>
+        </w:rPr>
+        <w:t>"Deepfake" is the VA's word for a fake post, not a video.</w:t>
+      </w:r>
+      <w:r>
+        <w:t xml:space="preserve"> Don't promise a deepfake video.</w:t>
+      </w:r>
+    </w:p>
+    <w:p>
+      <w:pPr>
+        <w:pStyle w:val="ListBullet"/>
+        <w:spacing w:after="40"/>
+      </w:pPr>
+      <w:r>
+        <w:t>⚠️ No count of veterans, no total, no named victim, no news coverage of the Oct 14 warning.</w:t>
+      </w:r>
+    </w:p>
+    <w:p>
+      <w:pPr>
+        <w:pStyle w:val="Heading3"/>
+      </w:pPr>
+      <w:r>
+        <w:rPr>
+          <w:color w:val="333333"/>
+          <w:sz w:val="22"/>
+        </w:rPr>
+        <w:t>STORY 10 — AMAZON REAL VS. FAKE REFUNDS</w:t>
+      </w:r>
+    </w:p>
+    <w:p>
+      <w:r>
+        <w:rPr>
+          <w:b/>
+        </w:rPr>
+        <w:t>Confirmed:</w:t>
+      </w:r>
+    </w:p>
+    <w:p>
+      <w:pPr>
+        <w:pStyle w:val="ListBullet"/>
+        <w:spacing w:after="40"/>
+      </w:pPr>
+      <w:r>
+        <w:t>FTC, Sept 17, 2026: the cap rises from $51 to $200; automatic payments by PayPal, Venmo or check from Oct 1, no claim; "no one from Amazon will ever ask you for money to get a refund."</w:t>
+      </w:r>
+    </w:p>
+    <w:p>
+      <w:pPr>
+        <w:pStyle w:val="ListBullet"/>
+        <w:spacing w:after="40"/>
+      </w:pPr>
+      <w:r>
+        <w:t>FTC Amazon refunds page: payments expire 60 days after they're issued; "The FTC will never ask you to pay to get a refund."</w:t>
+      </w:r>
+    </w:p>
+    <w:p>
+      <w:pPr>
+        <w:pStyle w:val="ListBullet"/>
+        <w:spacing w:after="40"/>
+      </w:pPr>
+      <w:r>
+        <w:t>KSL (Matt Gephardt), Sept 30, 2026: fake refund links may install malware; anyone asking you to "release" the money is a red flag.</w:t>
+      </w:r>
+    </w:p>
+    <w:p>
+      <w:r>
+        <w:rPr>
+          <w:b/>
+        </w:rPr>
+        <w:t>Sources:</w:t>
+      </w:r>
+      <w:r>
+        <w:t xml:space="preserve"> ftc.gov/news-events/news/press-releases/2026/09/ftc-announces-additional-payments-consumers-stemming-ftcs-amazon-prime-settlement · ftc.gov/enforcement/refunds/amazon-refunds · ksl.com/article/51630330/amazon-prime-refunds-are-coming-scammers-may-be-too</w:t>
+      </w:r>
+    </w:p>
+    <w:p>
+      <w:r>
+        <w:rPr>
+          <w:b/>
+        </w:rPr>
+        <w:t>NEEDS VERIFICATION:</w:t>
+      </w:r>
+    </w:p>
+    <w:p>
+      <w:pPr>
+        <w:pStyle w:val="ListBullet"/>
+        <w:spacing w:after="40"/>
+      </w:pPr>
+      <w:r>
+        <w:t xml:space="preserve">🚨 </w:t>
+      </w:r>
+      <w:r>
+        <w:rPr>
+          <w:b/>
+        </w:rPr>
+        <w:t>May already have aired.</w:t>
+      </w:r>
+      <w:r>
+        <w:t xml:space="preserve"> The 10/14 approval note sent the settlement to the 10/16 F1 ("If THIS Is Your Password — Change It Immediately!"). The description doesn't mention it; the transcript couldn't be checked. Ask before pitching.</w:t>
+      </w:r>
+    </w:p>
+    <w:p>
+      <w:pPr>
+        <w:pStyle w:val="ListBullet"/>
+        <w:spacing w:after="40"/>
+      </w:pPr>
+      <w:r>
+        <w:t>⚠️ No victim found, and no BBB, state AG or FTC alert specifically about fake settlement refunds.</w:t>
       </w:r>
     </w:p>
     <w:p>
@@ -2604,7 +4653,7 @@
         <w:t>A grandkid's face faked on a video call:</w:t>
       </w:r>
       <w:r>
-        <w:t xml:space="preserve"> no real case found. Every family case was a cloned voice (e.g. NBC Philadelphia, Aug 27, 2025, $6,000). The FBI ties live deepfake video to officials and executives (ic3.gov/PSA/2024/PSA241203) and fake-kidnapping photos and videos sent to families (ic3.gov/PSA/2025/PSA251205). Voice cloning is on the dead list (May 13).</w:t>
+        <w:t xml:space="preserve"> no real case found. Every family case was a cloned voice. The FBI ties live deepfake video to officials and executives (ic3.gov/PSA/2024/PSA241203). Its fake-kidnapping angle is now story 3.</w:t>
       </w:r>
     </w:p>
     <w:p>
@@ -2619,22 +4668,7 @@
         <w:t>Fake property tax bills:</w:t>
       </w:r>
       <w:r>
-        <w:t xml:space="preserve"> the seed lacounty.gov page doesn't describe a scam. 2026 warnings are about the AI-video "Form 1098-SR" scam (Wisconsin DOR, Sept 3, 2026), which was dropped as the 10/14 C. No mailed-notice video newer than a year, and no victims.</w:t>
-      </w:r>
-    </w:p>
-    <w:p>
-      <w:pPr>
-        <w:pStyle w:val="ListBullet"/>
-        <w:spacing w:after="40"/>
-      </w:pPr>
-      <w:r>
-        <w:rPr>
-          <w:b/>
-        </w:rPr>
-        <w:t>Amazon real-vs-fake refunds:</w:t>
-      </w:r>
-      <w:r>
-        <w:t xml:space="preserve"> FTC release Sept 17, 2026; KSL clip only 5.2K views; no victims. The settlement may have been covered 10/16 (unconfirmed).</w:t>
+        <w:t xml:space="preserve"> the seed lacounty.gov page doesn't describe a scam. 2026 warnings are about the AI-video "Form 1098-SR" scam (Wisconsin DOR, Sept 3, 2026), dropped as the 10/14 C. No recent mailed-notice video, no victims.</w:t>
       </w:r>
     </w:p>
     <w:p>
@@ -2664,7 +4698,7 @@
         <w:t>Pharmacy cash price vs. copay:</w:t>
       </w:r>
       <w:r>
-        <w:t xml:space="preserve"> the 2018 gag-clause laws are confirmed (govinfo.gov, Public Laws 115-262 and 115-263). No current TV clip, and the TikTok seed is unverified.</w:t>
+        <w:t xml:space="preserve"> the 2018 gag-clause laws are confirmed (govinfo.gov, Public Laws 115-262 and 115-263). No current TV clip; the TikTok seed is unverified.</w:t>
       </w:r>
     </w:p>
     <w:p>
@@ -2691,7 +4725,7 @@
         <w:t>Which A?</w:t>
       </w:r>
       <w:r>
-        <w:t xml:space="preserve"> My pick is Geek Squad: the broadest target, the most impersonated company, and a $20,000 loss. Bail has the better clips and the fresher warnings, but a narrower audience. Ryan's call on packaging.</w:t>
+        <w:t xml:space="preserve"> My pick is Geek Squad: the broadest target, the most impersonated company, and a $20,000 loss. Bail has better clips and fresher warnings but a narrower audience. Fake kidnapping is the most frightening, but needs Jeff's ruling on voice cloning.</w:t>
       </w:r>
     </w:p>
     <w:p>
@@ -2718,10 +4752,40 @@
         <w:rPr>
           <w:b/>
         </w:rPr>
+        <w:t>A 10/14 follow-up?</w:t>
+      </w:r>
+      <w:r>
+        <w:t xml:space="preserve"> NPR's "card declined" numbers are huge, but we did mall skincare two weeks ago. Yes as a B, or hold it?</w:t>
+      </w:r>
+    </w:p>
+    <w:p>
+      <w:pPr>
+        <w:pStyle w:val="ListNumber"/>
+        <w:spacing w:after="40"/>
+      </w:pPr>
+      <w:r>
+        <w:rPr>
+          <w:b/>
+        </w:rPr>
         <w:t>MyChart now or later?</w:t>
       </w:r>
       <w:r>
-        <w:t xml:space="preserve"> It's 19 days after the Medicare show. Run it as the B (enrollment ends Dec 7), or hold it? And who reaches the viewer for permission?</w:t>
+        <w:t xml:space="preserve"> It's 19 days after the Medicare show. Run it as a B (enrollment ends Dec 7), or hold it? Who reaches the viewer for permission?</w:t>
+      </w:r>
+    </w:p>
+    <w:p>
+      <w:pPr>
+        <w:pStyle w:val="ListNumber"/>
+        <w:spacing w:after="40"/>
+      </w:pPr>
+      <w:r>
+        <w:rPr>
+          <w:b/>
+        </w:rPr>
+        <w:t>Did the Amazon settlement air on 10/16?</w:t>
+      </w:r>
+      <w:r>
+        <w:t xml:space="preserve"> If yes, #10 is dead.</w:t>
       </w:r>
     </w:p>
     <w:p>
@@ -2748,7 +4812,7 @@
         <w:t>Expert:</w:t>
       </w:r>
       <w:r>
-        <w:t xml:space="preserve"> none assumed. If we book one, AARP's Amy Nofziger fits #1, #2 and #5.</w:t>
+        <w:t xml:space="preserve"> none assumed. If we book one, AARP's Amy Nofziger fits #1, #2, #3 and #8.</w:t>
       </w:r>
     </w:p>
     <w:p>

</xml_diff>